<commit_message>
Three comments this change made false
The LSAT reading map is in the same commit as a comment saying the
reading schemas are not mapped onto the LSAT. Also: 36 categories where
there are now 42, and a generated total of 104,918 written out in a
comment, which is the kind of number nobody regenerates. The count now
says where to read it instead.

Co-Authored-By: Claude Opus 5 <noreply@anthropic.com>
Claude-Session: https://claude.ai/code/session_01KVTxMNfqNdF8UZbVHZppBw
</commit_message>
<xml_diff>
--- a/playbook/BUILD_PLAYBOOK.docx
+++ b/playbook/BUILD_PLAYBOOK.docx
@@ -24,7 +24,7 @@
           <w:color w:val="6B7280"/>
           <w:sz w:val="18"/>
         </w:rPr>
-        <w:t>Built 2026-09-22 from commit 51a4153. 80 commits over 36 days. This document is generated: edit docs/playbook/ and data/playbook/incidents.jsonl, then run python3 src/build_playbook.py.</w:t>
+        <w:t>Built 2026-09-22 from commit 812510b. 81 commits over 36 days. This document is generated: edit docs/playbook/ and data/playbook/incidents.jsonl, then run python3 src/build_playbook.py.</w:t>
       </w:r>
     </w:p>
     <w:p>
@@ -43,7 +43,7 @@
     </w:p>
     <w:p>
       <w:r>
-        <w:t xml:space="preserve">The platform is Start From Nowhere, a test-preparation site with five adaptive exam trainers, a college and business-school rankings library, a blog, a forum, subscriptions through two payment processors, and an admin console. It was built between 2026-08-17 and 2026-09-22, which is 36 days, across 80 commits, by one owner directing a series of AI coding sessions. As of this build it is 54 Python files, 101 JavaScript files, 24 TypeScript edge functions, 35 migrations and 63 documents: 1978 tracked files in total.</w:t>
+        <w:t xml:space="preserve">The platform is Start From Nowhere, a test-preparation site with five adaptive exam trainers, a college and business-school rankings library, a blog, a forum, subscriptions through two payment processors, and an admin console. It was built between 2026-08-17 and 2026-09-22, which is 36 days, across 81 commits, by one owner directing a series of AI coding sessions. As of this build it is 54 Python files, 101 JavaScript files, 24 TypeScript edge functions, 35 migrations and 63 documents: 1978 tracked files in total.</w:t>
       </w:r>
     </w:p>
     <w:p>
@@ -5878,7 +5878,7 @@
     </w:p>
     <w:p>
       <w:r>
-        <w:t xml:space="preserve">80 commits in 36 days, one owner, a series of AI sessions. This chapter is how that was actually run, including the parts that did not work.</w:t>
+        <w:t xml:space="preserve">81 commits in 36 days, one owner, a series of AI sessions. This chapter is how that was actually run, including the parts that did not work.</w:t>
       </w:r>
     </w:p>
     <w:p>

</xml_diff>

<commit_message>
Three new reading passages: glacier retreat, orchard pollination, hymn singing
Each passage feeds the GMAT reading categories as two paragraphs and GRE
reading as one, so a passage is now the unit that grows two exams at once.
All three follow the corpus's shape: a received view, what it cannot account
for, two findings, what they suggest together, and a limit, with two stated
rules for the inference questions, each with a case, the conclusion it
licenses and two near misses. The researchers, places and records are
invented.

The corpus, premise, word matching and six sentence checks all pass. 30 more
GMAT items (v_st and v_inf) and 29 more GRE items: the runner retires a
schema after 400 duplicate draws in a row, which left one GRE question
undrawn. llms.txt and the editorial fact sheet say 33892 GMAT and 20267 GRE
items.

Co-Authored-By: Claude Opus 5.5 <noreply@anthropic.com>
Claude-Session: https://claude.ai/code/session_01AeK5kGKjhiSCfb8FSuuhmf
</commit_message>
<xml_diff>
--- a/playbook/BUILD_PLAYBOOK.docx
+++ b/playbook/BUILD_PLAYBOOK.docx
@@ -24,7 +24,7 @@
           <w:color w:val="6B7280"/>
           <w:sz w:val="18"/>
         </w:rPr>
-        <w:t>Built 2026-09-26 from commit 7e57cbb. 57 commits over 7 days. This document is generated: edit docs/playbook/ and data/playbook/incidents.jsonl, then run python3 src/build_playbook.py.</w:t>
+        <w:t>Built 2026-09-26 from commit 1c44efc. 58 commits over 7 days. This document is generated: edit docs/playbook/ and data/playbook/incidents.jsonl, then run python3 src/build_playbook.py.</w:t>
       </w:r>
     </w:p>
     <w:p>
@@ -43,7 +43,7 @@
     </w:p>
     <w:p>
       <w:r>
-        <w:t xml:space="preserve">The platform is Start From Nowhere, a test-preparation site with five adaptive exam trainers, a college and business-school rankings library, a blog, a forum, subscriptions through two payment processors, and an admin console. It was built between 2026-09-19 and 2026-09-26, which is 7 days, across 57 commits, by one owner directing a series of AI coding sessions. As of this build it is 76 Python files, 106 JavaScript files, 24 TypeScript edge functions, 35 migrations and 64 documents: 2014 tracked files in total.</w:t>
+        <w:t xml:space="preserve">The platform is Start From Nowhere, a test-preparation site with five adaptive exam trainers, a college and business-school rankings library, a blog, a forum, subscriptions through two payment processors, and an admin console. It was built between 2026-09-19 and 2026-09-26, which is 7 days, across 58 commits, by one owner directing a series of AI coding sessions. As of this build it is 77 Python files, 106 JavaScript files, 24 TypeScript edge functions, 35 migrations and 64 documents: 2015 tracked files in total.</w:t>
       </w:r>
     </w:p>
     <w:p>
@@ -5926,7 +5926,7 @@
     </w:p>
     <w:p>
       <w:r>
-        <w:t xml:space="preserve">57 commits in 7 days, one owner, a series of AI sessions. This chapter is how that was actually run, including the parts that did not work.</w:t>
+        <w:t xml:space="preserve">58 commits in 7 days, one owner, a series of AI sessions. This chapter is how that was actually run, including the parts that did not work.</w:t>
       </w:r>
     </w:p>
     <w:p>

</xml_diff>

<commit_message>
Add five more long reading passages
Hilltop beacons, a silk trade, early printing, water mills and river
mussels, invented like the rest of the corpus. The banks grow by 51 GMAT
items, 49 GRE items and 50 LSAT items (GMAT 34012, GRE 20387, LSAT 14292
of which 13920 are generated). Proofreading moved three trailing "whether
or not" clauses to the front of their findings, where the "is unreliable"
wrong answer had run straight into them.

Co-Authored-By: Claude Opus 5.5 <noreply@anthropic.com>
Claude-Session: https://claude.ai/code/session_01AeK5kGKjhiSCfb8FSuuhmf
</commit_message>
<xml_diff>
--- a/playbook/BUILD_PLAYBOOK.docx
+++ b/playbook/BUILD_PLAYBOOK.docx
@@ -24,7 +24,7 @@
           <w:color w:val="6B7280"/>
           <w:sz w:val="18"/>
         </w:rPr>
-        <w:t>Built 2026-09-26 from commit 6228bf2. 66 commits over 7 days. This document is generated: edit docs/playbook/ and data/playbook/incidents.jsonl, then run python3 src/build_playbook.py.</w:t>
+        <w:t>Built 2026-09-26 from commit fb0f474. 67 commits over 7 days. This document is generated: edit docs/playbook/ and data/playbook/incidents.jsonl, then run python3 src/build_playbook.py.</w:t>
       </w:r>
     </w:p>
     <w:p>
@@ -43,7 +43,7 @@
     </w:p>
     <w:p>
       <w:r>
-        <w:t xml:space="preserve">The platform is Start From Nowhere, a test-preparation site with five adaptive exam trainers, a college and business-school rankings library, a blog, a forum, subscriptions through two payment processors, and an admin console. It was built between 2026-09-19 and 2026-09-26, which is 7 days, across 66 commits, by one owner directing a series of AI coding sessions. As of this build it is 78 Python files, 106 JavaScript files, 24 TypeScript edge functions, 35 migrations and 64 documents: 2020 tracked files in total.</w:t>
+        <w:t xml:space="preserve">The platform is Start From Nowhere, a test-preparation site with five adaptive exam trainers, a college and business-school rankings library, a blog, a forum, subscriptions through two payment processors, and an admin console. It was built between 2026-09-19 and 2026-09-26, which is 7 days, across 67 commits, by one owner directing a series of AI coding sessions. As of this build it is 78 Python files, 106 JavaScript files, 24 TypeScript edge functions, 35 migrations and 64 documents: 2022 tracked files in total.</w:t>
       </w:r>
     </w:p>
     <w:p>
@@ -5926,7 +5926,7 @@
     </w:p>
     <w:p>
       <w:r>
-        <w:t xml:space="preserve">66 commits in 7 days, one owner, a series of AI sessions. This chapter is how that was actually run, including the parts that did not work.</w:t>
+        <w:t xml:space="preserve">67 commits in 7 days, one owner, a series of AI sessions. This chapter is how that was actually run, including the parts that did not work.</w:t>
       </w:r>
     </w:p>
     <w:p>

</xml_diff>

<commit_message>
Add five more long reading passages (#112)
Hilltop beacons, a silk trade, early printing, water mills and river
mussels, invented like the rest of the corpus. The banks grow by 51 GMAT
items, 49 GRE items and 50 LSAT items (GMAT 34012, GRE 20387, LSAT 14292
of which 13920 are generated). Proofreading moved three trailing "whether
or not" clauses to the front of their findings, where the "is unreliable"
wrong answer had run straight into them.


Claude-Session: https://claude.ai/code/session_01AeK5kGKjhiSCfb8FSuuhmf

Co-authored-by: Claude <noreply@anthropic.com>
</commit_message>
<xml_diff>
--- a/playbook/BUILD_PLAYBOOK.docx
+++ b/playbook/BUILD_PLAYBOOK.docx
@@ -24,7 +24,7 @@
           <w:color w:val="6B7280"/>
           <w:sz w:val="18"/>
         </w:rPr>
-        <w:t>Built 2026-09-26 from commit 6228bf2. 66 commits over 7 days. This document is generated: edit docs/playbook/ and data/playbook/incidents.jsonl, then run python3 src/build_playbook.py.</w:t>
+        <w:t>Built 2026-09-26 from commit fb0f474. 67 commits over 7 days. This document is generated: edit docs/playbook/ and data/playbook/incidents.jsonl, then run python3 src/build_playbook.py.</w:t>
       </w:r>
     </w:p>
     <w:p>
@@ -43,7 +43,7 @@
     </w:p>
     <w:p>
       <w:r>
-        <w:t xml:space="preserve">The platform is Start From Nowhere, a test-preparation site with five adaptive exam trainers, a college and business-school rankings library, a blog, a forum, subscriptions through two payment processors, and an admin console. It was built between 2026-09-19 and 2026-09-26, which is 7 days, across 66 commits, by one owner directing a series of AI coding sessions. As of this build it is 78 Python files, 106 JavaScript files, 24 TypeScript edge functions, 35 migrations and 64 documents: 2020 tracked files in total.</w:t>
+        <w:t xml:space="preserve">The platform is Start From Nowhere, a test-preparation site with five adaptive exam trainers, a college and business-school rankings library, a blog, a forum, subscriptions through two payment processors, and an admin console. It was built between 2026-09-19 and 2026-09-26, which is 7 days, across 67 commits, by one owner directing a series of AI coding sessions. As of this build it is 78 Python files, 106 JavaScript files, 24 TypeScript edge functions, 35 migrations and 64 documents: 2022 tracked files in total.</w:t>
       </w:r>
     </w:p>
     <w:p>
@@ -5926,7 +5926,7 @@
     </w:p>
     <w:p>
       <w:r>
-        <w:t xml:space="preserve">66 commits in 7 days, one owner, a series of AI sessions. This chapter is how that was actually run, including the parts that did not work.</w:t>
+        <w:t xml:space="preserve">67 commits in 7 days, one owner, a series of AI sessions. This chapter is how that was actually run, including the parts that did not work.</w:t>
       </w:r>
     </w:p>
     <w:p>

</xml_diff>

<commit_message>
Add five more long reading passages: a moth, a port's tides, cattle fairs, village names and pottery
Invented like the rest of the corpus, each passage is a revision
narrative (a received view, the problem it could not explain, two
findings with their methods, the revised account and a closing
limit) with its two rules printed, so every inference key follows by
modus tollens from what the reader can see. The banks grow by 50
GMAT, 50 GRE and 50 LSAT items: GMAT 34062, GRE 20438 and LSAT 14342,
of which 13970 are generated. llms.txt and the EDITORIAL product
facts carry the new counts, which the build's count guard checks.

A sample of every question type from the new passages was read for
seams. The one "whether or not" finding opens its clause, so the "is
unreliable" distractor does not run into it.

Co-Authored-By: Claude Opus 5.5 <noreply@anthropic.com>
Claude-Session: https://claude.ai/code/session_01AeK5kGKjhiSCfb8FSuuhmf
</commit_message>
<xml_diff>
--- a/playbook/BUILD_PLAYBOOK.docx
+++ b/playbook/BUILD_PLAYBOOK.docx
@@ -24,7 +24,7 @@
           <w:color w:val="6B7280"/>
           <w:sz w:val="18"/>
         </w:rPr>
-        <w:t>Built 2026-09-27 from commit a58721b. 89 commits over 8 days. This document is generated: edit docs/playbook/ and data/playbook/incidents.jsonl, then run python3 src/build_playbook.py.</w:t>
+        <w:t>Built 2026-09-27 from commit db352ce. 90 commits over 8 days. This document is generated: edit docs/playbook/ and data/playbook/incidents.jsonl, then run python3 src/build_playbook.py.</w:t>
       </w:r>
     </w:p>
     <w:p>
@@ -43,7 +43,7 @@
     </w:p>
     <w:p>
       <w:r>
-        <w:t xml:space="preserve">The platform is Start From Nowhere, a test-preparation site with five adaptive exam trainers, a college and business-school rankings library, a blog, a forum, subscriptions through two payment processors, and an admin console. It was built between 2026-09-19 and 2026-09-27, which is 8 days, across 89 commits, by one owner directing a series of AI coding sessions. As of this build it is 83 Python files, 107 JavaScript files, 24 TypeScript edge functions, 35 migrations and 64 documents: 2042 tracked files in total.</w:t>
+        <w:t xml:space="preserve">The platform is Start From Nowhere, a test-preparation site with five adaptive exam trainers, a college and business-school rankings library, a blog, a forum, subscriptions through two payment processors, and an admin console. It was built between 2026-09-19 and 2026-09-27, which is 8 days, across 90 commits, by one owner directing a series of AI coding sessions. As of this build it is 83 Python files, 107 JavaScript files, 24 TypeScript edge functions, 35 migrations and 64 documents: 2042 tracked files in total.</w:t>
       </w:r>
     </w:p>
     <w:p>
@@ -5942,7 +5942,7 @@
     </w:p>
     <w:p>
       <w:r>
-        <w:t xml:space="preserve">89 commits in 8 days, one owner, a series of AI sessions. This chapter is how that was actually run, including the parts that did not work.</w:t>
+        <w:t xml:space="preserve">90 commits in 8 days, one owner, a series of AI sessions. This chapter is how that was actually run, including the parts that did not work.</w:t>
       </w:r>
     </w:p>
     <w:p>

</xml_diff>

<commit_message>
Add five more long reading passages: a moth, a port's tides, cattle fairs, village names and pottery (#134)
Invented like the rest of the corpus, each passage is a revision
narrative (a received view, the problem it could not explain, two
findings with their methods, the revised account and a closing
limit) with its two rules printed, so every inference key follows by
modus tollens from what the reader can see. The banks grow by 50
GMAT, 50 GRE and 50 LSAT items: GMAT 34062, GRE 20438 and LSAT 14342,
of which 13970 are generated. llms.txt and the EDITORIAL product
facts carry the new counts, which the build's count guard checks.

A sample of every question type from the new passages was read for
seams. The one "whether or not" finding opens its clause, so the "is
unreliable" distractor does not run into it.


Claude-Session: https://claude.ai/code/session_01AeK5kGKjhiSCfb8FSuuhmf

Co-authored-by: Claude <noreply@anthropic.com>
</commit_message>
<xml_diff>
--- a/playbook/BUILD_PLAYBOOK.docx
+++ b/playbook/BUILD_PLAYBOOK.docx
@@ -24,7 +24,7 @@
           <w:color w:val="6B7280"/>
           <w:sz w:val="18"/>
         </w:rPr>
-        <w:t>Built 2026-09-27 from commit a58721b. 89 commits over 8 days. This document is generated: edit docs/playbook/ and data/playbook/incidents.jsonl, then run python3 src/build_playbook.py.</w:t>
+        <w:t>Built 2026-09-27 from commit db352ce. 90 commits over 8 days. This document is generated: edit docs/playbook/ and data/playbook/incidents.jsonl, then run python3 src/build_playbook.py.</w:t>
       </w:r>
     </w:p>
     <w:p>
@@ -43,7 +43,7 @@
     </w:p>
     <w:p>
       <w:r>
-        <w:t xml:space="preserve">The platform is Start From Nowhere, a test-preparation site with five adaptive exam trainers, a college and business-school rankings library, a blog, a forum, subscriptions through two payment processors, and an admin console. It was built between 2026-09-19 and 2026-09-27, which is 8 days, across 89 commits, by one owner directing a series of AI coding sessions. As of this build it is 83 Python files, 107 JavaScript files, 24 TypeScript edge functions, 35 migrations and 64 documents: 2042 tracked files in total.</w:t>
+        <w:t xml:space="preserve">The platform is Start From Nowhere, a test-preparation site with five adaptive exam trainers, a college and business-school rankings library, a blog, a forum, subscriptions through two payment processors, and an admin console. It was built between 2026-09-19 and 2026-09-27, which is 8 days, across 90 commits, by one owner directing a series of AI coding sessions. As of this build it is 83 Python files, 107 JavaScript files, 24 TypeScript edge functions, 35 migrations and 64 documents: 2042 tracked files in total.</w:t>
       </w:r>
     </w:p>
     <w:p>
@@ -5942,7 +5942,7 @@
     </w:p>
     <w:p>
       <w:r>
-        <w:t xml:space="preserve">89 commits in 8 days, one owner, a series of AI sessions. This chapter is how that was actually run, including the parts that did not work.</w:t>
+        <w:t xml:space="preserve">90 commits in 8 days, one owner, a series of AI sessions. This chapter is how that was actually run, including the parts that did not work.</w:t>
       </w:r>
     </w:p>
     <w:p>

</xml_diff>

<commit_message>
Report a PDF sent as a download as not HTML, the way CI's Chromium opens every PDF
The render smoke failed in CI on its PDF check: Playwright's own
Chromium there has no PDF viewer, so it turns a PDF navigation into a
download and page.goto throws "Download is starting" before the reader
can look at the response. The sandbox's Chromium opens the viewer, so
the check passed here. Both are the same refusal, and render_page.js
now reports the download as "not an HTML page" too.

The smoke adds a PDF sent with Content-Disposition: attachment, which
every Chromium downloads, so the path CI takes runs locally as well.
Without the fix that check fails here with the error CI printed.

Co-Authored-By: Claude Opus 5.5 <noreply@anthropic.com>
Claude-Session: https://claude.ai/code/session_01AeK5kGKjhiSCfb8FSuuhmf
</commit_message>
<xml_diff>
--- a/playbook/BUILD_PLAYBOOK.docx
+++ b/playbook/BUILD_PLAYBOOK.docx
@@ -24,7 +24,7 @@
           <w:color w:val="6B7280"/>
           <w:sz w:val="18"/>
         </w:rPr>
-        <w:t>Built 2026-09-27 from commit 4bcd40c. 91 commits over 8 days. This document is generated: edit docs/playbook/ and data/playbook/incidents.jsonl, then run python3 src/build_playbook.py.</w:t>
+        <w:t>Built 2026-09-27 from commit 63eaf72. 92 commits over 8 days. This document is generated: edit docs/playbook/ and data/playbook/incidents.jsonl, then run python3 src/build_playbook.py.</w:t>
       </w:r>
     </w:p>
     <w:p>
@@ -43,7 +43,7 @@
     </w:p>
     <w:p>
       <w:r>
-        <w:t xml:space="preserve">The platform is Start From Nowhere, a test-preparation site with five adaptive exam trainers, a college and business-school rankings library, a blog, a forum, subscriptions through two payment processors, and an admin console. It was built between 2026-09-19 and 2026-09-27, which is 8 days, across 91 commits, by one owner directing a series of AI coding sessions. As of this build it is 83 Python files, 109 JavaScript files, 24 TypeScript edge functions, 35 migrations and 64 documents: 2044 tracked files in total.</w:t>
+        <w:t xml:space="preserve">The platform is Start From Nowhere, a test-preparation site with five adaptive exam trainers, a college and business-school rankings library, a blog, a forum, subscriptions through two payment processors, and an admin console. It was built between 2026-09-19 and 2026-09-27, which is 8 days, across 92 commits, by one owner directing a series of AI coding sessions. As of this build it is 83 Python files, 109 JavaScript files, 24 TypeScript edge functions, 35 migrations and 64 documents: 2044 tracked files in total.</w:t>
       </w:r>
     </w:p>
     <w:p>
@@ -5958,7 +5958,7 @@
     </w:p>
     <w:p>
       <w:r>
-        <w:t xml:space="preserve">91 commits in 8 days, one owner, a series of AI sessions. This chapter is how that was actually run, including the parts that did not work.</w:t>
+        <w:t xml:space="preserve">92 commits in 8 days, one owner, a series of AI sessions. This chapter is how that was actually run, including the parts that did not work.</w:t>
       </w:r>
     </w:p>
     <w:p>

</xml_diff>

<commit_message>
Link each exam guide to its exam's published posts
The five exam guides at /exams/<exam>/ linked to no post, so the posts
written for each exam, what it costs and what a good score is among
them, had no link from the pages that rank for the exam. Each guide
now ends with "From the Study Room": up to six published posts whose
slug names the exam as a whole word, newest first, so PSAT posts stay
off the SAT guide and SAT vs ACT sits on both.

A post joins its guide on the day it publishes: build_exams reads the
posts' dates against the same build date the blog uses, and the daily
publish rebuilds both. The blog build now fails if a guide links a
post it did not publish, which catches the two ever being built for
different dates; a blog build dated a week earlier than the guides
failed on the ACT guide's link to the SAT vs ACT post.

Co-Authored-By: Claude Opus 5.5 <noreply@anthropic.com>
Claude-Session: https://claude.ai/code/session_01AeK5kGKjhiSCfb8FSuuhmf
</commit_message>
<xml_diff>
--- a/playbook/BUILD_PLAYBOOK.docx
+++ b/playbook/BUILD_PLAYBOOK.docx
@@ -24,7 +24,7 @@
           <w:color w:val="6B7280"/>
           <w:sz w:val="18"/>
         </w:rPr>
-        <w:t>Built 2026-09-27 from commit 4882952. 114 commits over 8 days. This document is generated: edit docs/playbook/ and data/playbook/incidents.jsonl, then run python3 src/build_playbook.py.</w:t>
+        <w:t>Built 2026-09-27 from commit f7dbd12. 115 commits over 8 days. This document is generated: edit docs/playbook/ and data/playbook/incidents.jsonl, then run python3 src/build_playbook.py.</w:t>
       </w:r>
     </w:p>
     <w:p>
@@ -43,7 +43,7 @@
     </w:p>
     <w:p>
       <w:r>
-        <w:t xml:space="preserve">The platform is Start From Nowhere, a test-preparation site with five adaptive exam trainers, a college and business-school rankings library, a blog, a forum, subscriptions through two payment processors, and an admin console. It was built between 2026-09-19 and 2026-09-27, which is 8 days, across 114 commits, by one owner directing a series of AI coding sessions. As of this build it is 85 Python files, 111 JavaScript files, 24 TypeScript edge functions, 35 migrations and 64 documents: 2062 tracked files in total.</w:t>
+        <w:t xml:space="preserve">The platform is Start From Nowhere, a test-preparation site with five adaptive exam trainers, a college and business-school rankings library, a blog, a forum, subscriptions through two payment processors, and an admin console. It was built between 2026-09-19 and 2026-09-27, which is 8 days, across 115 commits, by one owner directing a series of AI coding sessions. As of this build it is 85 Python files, 111 JavaScript files, 24 TypeScript edge functions, 35 migrations and 64 documents: 2062 tracked files in total.</w:t>
       </w:r>
     </w:p>
     <w:p>
@@ -5974,7 +5974,7 @@
     </w:p>
     <w:p>
       <w:r>
-        <w:t xml:space="preserve">114 commits in 8 days, one owner, a series of AI sessions. This chapter is how that was actually run, including the parts that did not work.</w:t>
+        <w:t xml:space="preserve">115 commits in 8 days, one owner, a series of AI sessions. This chapter is how that was actually run, including the parts that did not work.</w:t>
       </w:r>
     </w:p>
     <w:p>

</xml_diff>

<commit_message>
Link each exam guide to its exam's published posts (#159)
The five exam guides at /exams/<exam>/ linked to no post, so the posts
written for each exam, what it costs and what a good score is among
them, had no link from the pages that rank for the exam. Each guide
now ends with "From the Study Room": up to six published posts whose
slug names the exam as a whole word, newest first, so PSAT posts stay
off the SAT guide and SAT vs ACT sits on both.

A post joins its guide on the day it publishes: build_exams reads the
posts' dates against the same build date the blog uses, and the daily
publish rebuilds both. The blog build now fails if a guide links a
post it did not publish, which catches the two ever being built for
different dates; a blog build dated a week earlier than the guides
failed on the ACT guide's link to the SAT vs ACT post.


Claude-Session: https://claude.ai/code/session_01AeK5kGKjhiSCfb8FSuuhmf

Co-authored-by: Claude <noreply@anthropic.com>
</commit_message>
<xml_diff>
--- a/playbook/BUILD_PLAYBOOK.docx
+++ b/playbook/BUILD_PLAYBOOK.docx
@@ -24,7 +24,7 @@
           <w:color w:val="6B7280"/>
           <w:sz w:val="18"/>
         </w:rPr>
-        <w:t>Built 2026-09-27 from commit 4882952. 114 commits over 8 days. This document is generated: edit docs/playbook/ and data/playbook/incidents.jsonl, then run python3 src/build_playbook.py.</w:t>
+        <w:t>Built 2026-09-27 from commit f7dbd12. 115 commits over 8 days. This document is generated: edit docs/playbook/ and data/playbook/incidents.jsonl, then run python3 src/build_playbook.py.</w:t>
       </w:r>
     </w:p>
     <w:p>
@@ -43,7 +43,7 @@
     </w:p>
     <w:p>
       <w:r>
-        <w:t xml:space="preserve">The platform is Start From Nowhere, a test-preparation site with five adaptive exam trainers, a college and business-school rankings library, a blog, a forum, subscriptions through two payment processors, and an admin console. It was built between 2026-09-19 and 2026-09-27, which is 8 days, across 114 commits, by one owner directing a series of AI coding sessions. As of this build it is 85 Python files, 111 JavaScript files, 24 TypeScript edge functions, 35 migrations and 64 documents: 2062 tracked files in total.</w:t>
+        <w:t xml:space="preserve">The platform is Start From Nowhere, a test-preparation site with five adaptive exam trainers, a college and business-school rankings library, a blog, a forum, subscriptions through two payment processors, and an admin console. It was built between 2026-09-19 and 2026-09-27, which is 8 days, across 115 commits, by one owner directing a series of AI coding sessions. As of this build it is 85 Python files, 111 JavaScript files, 24 TypeScript edge functions, 35 migrations and 64 documents: 2062 tracked files in total.</w:t>
       </w:r>
     </w:p>
     <w:p>
@@ -5974,7 +5974,7 @@
     </w:p>
     <w:p>
       <w:r>
-        <w:t xml:space="preserve">114 commits in 8 days, one owner, a series of AI sessions. This chapter is how that was actually run, including the parts that did not work.</w:t>
+        <w:t xml:space="preserve">115 commits in 8 days, one owner, a series of AI sessions. This chapter is how that was actually run, including the parts that did not work.</w:t>
       </w:r>
     </w:p>
     <w:p>

</xml_diff>

<commit_message>
Link each school page to the published posts that quote it
Eleven MBA posts link to 54 school pages where they quote the schools'
figures, and no school page linked a post back. A school page now
shows "In the Study Room": up to five published posts whose body links
that school, newest first, with a note that they quote the program's
figures with their sources.

Like the exam guides' list, it counts only posts dated on or before
the build date, so a post joins its schools' pages the day it
publishes. None of the eleven is published yet: no school page shows
the section today, the first appear on October 28 with the tuition
post, and a build dated November 21 shows it on all 54. The blog
build's check that every link into the blog is a post it published
now covers the school pages as well as the exam guides.

Co-Authored-By: Claude Opus 5.5 <noreply@anthropic.com>
Claude-Session: https://claude.ai/code/session_01AeK5kGKjhiSCfb8FSuuhmf
</commit_message>
<xml_diff>
--- a/playbook/BUILD_PLAYBOOK.docx
+++ b/playbook/BUILD_PLAYBOOK.docx
@@ -24,7 +24,7 @@
           <w:color w:val="6B7280"/>
           <w:sz w:val="18"/>
         </w:rPr>
-        <w:t>Built 2026-09-27 from commit f7dbd12. 115 commits over 8 days. This document is generated: edit docs/playbook/ and data/playbook/incidents.jsonl, then run python3 src/build_playbook.py.</w:t>
+        <w:t>Built 2026-09-27 from commit 1f38825. 116 commits over 8 days. This document is generated: edit docs/playbook/ and data/playbook/incidents.jsonl, then run python3 src/build_playbook.py.</w:t>
       </w:r>
     </w:p>
     <w:p>
@@ -43,7 +43,7 @@
     </w:p>
     <w:p>
       <w:r>
-        <w:t xml:space="preserve">The platform is Start From Nowhere, a test-preparation site with five adaptive exam trainers, a college and business-school rankings library, a blog, a forum, subscriptions through two payment processors, and an admin console. It was built between 2026-09-19 and 2026-09-27, which is 8 days, across 115 commits, by one owner directing a series of AI coding sessions. As of this build it is 85 Python files, 111 JavaScript files, 24 TypeScript edge functions, 35 migrations and 64 documents: 2062 tracked files in total.</w:t>
+        <w:t xml:space="preserve">The platform is Start From Nowhere, a test-preparation site with five adaptive exam trainers, a college and business-school rankings library, a blog, a forum, subscriptions through two payment processors, and an admin console. It was built between 2026-09-19 and 2026-09-27, which is 8 days, across 116 commits, by one owner directing a series of AI coding sessions. As of this build it is 85 Python files, 111 JavaScript files, 24 TypeScript edge functions, 35 migrations and 64 documents: 2062 tracked files in total.</w:t>
       </w:r>
     </w:p>
     <w:p>
@@ -5974,7 +5974,7 @@
     </w:p>
     <w:p>
       <w:r>
-        <w:t xml:space="preserve">115 commits in 8 days, one owner, a series of AI sessions. This chapter is how that was actually run, including the parts that did not work.</w:t>
+        <w:t xml:space="preserve">116 commits in 8 days, one owner, a series of AI sessions. This chapter is how that was actually run, including the parts that did not work.</w:t>
       </w:r>
     </w:p>
     <w:p>

</xml_diff>

<commit_message>
Link each school page to the published posts that quote it (#160)
Eleven MBA posts link to 54 school pages where they quote the schools'
figures, and no school page linked a post back. A school page now
shows "In the Study Room": up to five published posts whose body links
that school, newest first, with a note that they quote the program's
figures with their sources.

Like the exam guides' list, it counts only posts dated on or before
the build date, so a post joins its schools' pages the day it
publishes. None of the eleven is published yet: no school page shows
the section today, the first appear on October 28 with the tuition
post, and a build dated November 21 shows it on all 54. The blog
build's check that every link into the blog is a post it published
now covers the school pages as well as the exam guides.


Claude-Session: https://claude.ai/code/session_01AeK5kGKjhiSCfb8FSuuhmf

Co-authored-by: Claude <noreply@anthropic.com>
</commit_message>
<xml_diff>
--- a/playbook/BUILD_PLAYBOOK.docx
+++ b/playbook/BUILD_PLAYBOOK.docx
@@ -24,7 +24,7 @@
           <w:color w:val="6B7280"/>
           <w:sz w:val="18"/>
         </w:rPr>
-        <w:t>Built 2026-09-27 from commit f7dbd12. 115 commits over 8 days. This document is generated: edit docs/playbook/ and data/playbook/incidents.jsonl, then run python3 src/build_playbook.py.</w:t>
+        <w:t>Built 2026-09-27 from commit 1f38825. 116 commits over 8 days. This document is generated: edit docs/playbook/ and data/playbook/incidents.jsonl, then run python3 src/build_playbook.py.</w:t>
       </w:r>
     </w:p>
     <w:p>
@@ -43,7 +43,7 @@
     </w:p>
     <w:p>
       <w:r>
-        <w:t xml:space="preserve">The platform is Start From Nowhere, a test-preparation site with five adaptive exam trainers, a college and business-school rankings library, a blog, a forum, subscriptions through two payment processors, and an admin console. It was built between 2026-09-19 and 2026-09-27, which is 8 days, across 115 commits, by one owner directing a series of AI coding sessions. As of this build it is 85 Python files, 111 JavaScript files, 24 TypeScript edge functions, 35 migrations and 64 documents: 2062 tracked files in total.</w:t>
+        <w:t xml:space="preserve">The platform is Start From Nowhere, a test-preparation site with five adaptive exam trainers, a college and business-school rankings library, a blog, a forum, subscriptions through two payment processors, and an admin console. It was built between 2026-09-19 and 2026-09-27, which is 8 days, across 116 commits, by one owner directing a series of AI coding sessions. As of this build it is 85 Python files, 111 JavaScript files, 24 TypeScript edge functions, 35 migrations and 64 documents: 2062 tracked files in total.</w:t>
       </w:r>
     </w:p>
     <w:p>
@@ -5974,7 +5974,7 @@
     </w:p>
     <w:p>
       <w:r>
-        <w:t xml:space="preserve">115 commits in 8 days, one owner, a series of AI sessions. This chapter is how that was actually run, including the parts that did not work.</w:t>
+        <w:t xml:space="preserve">116 commits in 8 days, one owner, a series of AI sessions. This chapter is how that was actually run, including the parts that did not work.</w:t>
       </w:r>
     </w:p>
     <w:p>

</xml_diff>

<commit_message>
Queue "How Many Times Can You Take the GMAT, GRE, LSAT, SAT, and ACT?" for November 25
Every limit is read from the test maker's own page on September 27, 2026: the
GMAT's 5 in a rolling 12 months with at least 16 calendar days between, the
GRE's 5 in any 365 days with 21 between, the LSAT's 5 since July 2021 and 7 in
all, and no limit on the SAT or the ACT, with what each counts as an attempt.

The GMAT and GRE retake facts now say that canceled scores count, and a new LSAT
key fact records what counts against LSAC's limits and what does not, so the
weekly source check reads each rule the post states. EDITORIAL.md gains a
retake block.

Co-Authored-By: Claude Opus 5.5 <noreply@anthropic.com>
Claude-Session: https://claude.ai/code/session_01AeK5kGKjhiSCfb8FSuuhmf
</commit_message>
<xml_diff>
--- a/playbook/BUILD_PLAYBOOK.docx
+++ b/playbook/BUILD_PLAYBOOK.docx
@@ -24,7 +24,7 @@
           <w:color w:val="6B7280"/>
           <w:sz w:val="18"/>
         </w:rPr>
-        <w:t>Built 2026-09-27 from commit 9a074f1. 121 commits over 8 days. This document is generated: edit docs/playbook/ and data/playbook/incidents.jsonl, then run python3 src/build_playbook.py.</w:t>
+        <w:t>Built 2026-09-27 from commit b6727f6. 122 commits over 8 days. This document is generated: edit docs/playbook/ and data/playbook/incidents.jsonl, then run python3 src/build_playbook.py.</w:t>
       </w:r>
     </w:p>
     <w:p>
@@ -43,7 +43,7 @@
     </w:p>
     <w:p>
       <w:r>
-        <w:t xml:space="preserve">The platform is Start From Nowhere, a test-preparation site with five adaptive exam trainers, a college and business-school rankings library, a blog, a forum, subscriptions through two payment processors, and an admin console. It was built between 2026-09-19 and 2026-09-27, which is 8 days, across 121 commits, by one owner directing a series of AI coding sessions. As of this build it is 86 Python files, 112 JavaScript files, 24 TypeScript edge functions, 35 migrations and 65 documents: 2098 tracked files in total.</w:t>
+        <w:t xml:space="preserve">The platform is Start From Nowhere, a test-preparation site with five adaptive exam trainers, a college and business-school rankings library, a blog, a forum, subscriptions through two payment processors, and an admin console. It was built between 2026-09-19 and 2026-09-27, which is 8 days, across 122 commits, by one owner directing a series of AI coding sessions. As of this build it is 86 Python files, 112 JavaScript files, 24 TypeScript edge functions, 35 migrations and 65 documents: 2098 tracked files in total.</w:t>
       </w:r>
     </w:p>
     <w:p>
@@ -5990,7 +5990,7 @@
     </w:p>
     <w:p>
       <w:r>
-        <w:t xml:space="preserve">121 commits in 8 days, one owner, a series of AI sessions. This chapter is how that was actually run, including the parts that did not work.</w:t>
+        <w:t xml:space="preserve">122 commits in 8 days, one owner, a series of AI sessions. This chapter is how that was actually run, including the parts that did not work.</w:t>
       </w:r>
     </w:p>
     <w:p>

</xml_diff>

<commit_message>
Queue "How Many Times Can You Take the GMAT, GRE, LSAT, SAT, and ACT?" for November 25 (#167)
Every limit is read from the test maker's own page on September 27, 2026: the GMAT's 5 in a rolling 12 months with at least 16 calendar days between, the GRE's 5 in any 365 days with 21 between, the LSAT's 5 since July 2021 and 7 in all, and no limit on the SAT or the ACT, with what each counts as an attempt. The GMAT and GRE retake facts now say canceled scores count, and a new LSAT key fact records what counts against LSAC's limits, so the weekly source check reads each rule the post states.

Co-Authored-By: Claude Opus 5.5 <noreply@anthropic.com>
Claude-Session: https://claude.ai/code/session_01AeK5kGKjhiSCfb8FSuuhmf
</commit_message>
<xml_diff>
--- a/playbook/BUILD_PLAYBOOK.docx
+++ b/playbook/BUILD_PLAYBOOK.docx
@@ -24,7 +24,7 @@
           <w:color w:val="6B7280"/>
           <w:sz w:val="18"/>
         </w:rPr>
-        <w:t>Built 2026-09-27 from commit 9a074f1. 121 commits over 8 days. This document is generated: edit docs/playbook/ and data/playbook/incidents.jsonl, then run python3 src/build_playbook.py.</w:t>
+        <w:t>Built 2026-09-27 from commit b6727f6. 122 commits over 8 days. This document is generated: edit docs/playbook/ and data/playbook/incidents.jsonl, then run python3 src/build_playbook.py.</w:t>
       </w:r>
     </w:p>
     <w:p>
@@ -43,7 +43,7 @@
     </w:p>
     <w:p>
       <w:r>
-        <w:t xml:space="preserve">The platform is Start From Nowhere, a test-preparation site with five adaptive exam trainers, a college and business-school rankings library, a blog, a forum, subscriptions through two payment processors, and an admin console. It was built between 2026-09-19 and 2026-09-27, which is 8 days, across 121 commits, by one owner directing a series of AI coding sessions. As of this build it is 86 Python files, 112 JavaScript files, 24 TypeScript edge functions, 35 migrations and 65 documents: 2098 tracked files in total.</w:t>
+        <w:t xml:space="preserve">The platform is Start From Nowhere, a test-preparation site with five adaptive exam trainers, a college and business-school rankings library, a blog, a forum, subscriptions through two payment processors, and an admin console. It was built between 2026-09-19 and 2026-09-27, which is 8 days, across 122 commits, by one owner directing a series of AI coding sessions. As of this build it is 86 Python files, 112 JavaScript files, 24 TypeScript edge functions, 35 migrations and 65 documents: 2098 tracked files in total.</w:t>
       </w:r>
     </w:p>
     <w:p>
@@ -5990,7 +5990,7 @@
     </w:p>
     <w:p>
       <w:r>
-        <w:t xml:space="preserve">121 commits in 8 days, one owner, a series of AI sessions. This chapter is how that was actually run, including the parts that did not work.</w:t>
+        <w:t xml:space="preserve">122 commits in 8 days, one owner, a series of AI sessions. This chapter is how that was actually run, including the parts that did not work.</w:t>
       </w:r>
     </w:p>
     <w:p>

</xml_diff>

<commit_message>
Queue "When Do GMAT, GRE, LSAT, SAT, and ACT Scores Come Out?" for November 27
Each test maker's rule, read on September 27, 2026, with this testing year's
release dates for the LSAT, the SAT and the ACT from the same tables the test date
pages use: GMAT within 5 days (up to 20, and never expedited), GRE 8 to 10 days,
LSAT 18 days after each administration's last test day with an approved writing
sample on file, SAT 13 days after each fall weekend test, and ACT about 2 to 4
weeks for over 97 percent of scores. ACT's online testing page gives wider ranges,
and the post says which page says which.

A new ACT fact and a fuller GRE one put the post's statements under the weekly
source check, and EDITORIAL.md gains a score release block.

Co-Authored-By: Claude Opus 5.5 <noreply@anthropic.com>
Claude-Session: https://claude.ai/code/session_01AeK5kGKjhiSCfb8FSuuhmf
</commit_message>
<xml_diff>
--- a/playbook/BUILD_PLAYBOOK.docx
+++ b/playbook/BUILD_PLAYBOOK.docx
@@ -24,7 +24,7 @@
           <w:color w:val="6B7280"/>
           <w:sz w:val="18"/>
         </w:rPr>
-        <w:t>Built 2026-09-27 from commit 847a00a. 124 commits over 8 days. This document is generated: edit docs/playbook/ and data/playbook/incidents.jsonl, then run python3 src/build_playbook.py.</w:t>
+        <w:t>Built 2026-09-27 from commit 3519ae8. 125 commits over 8 days. This document is generated: edit docs/playbook/ and data/playbook/incidents.jsonl, then run python3 src/build_playbook.py.</w:t>
       </w:r>
     </w:p>
     <w:p>
@@ -43,7 +43,7 @@
     </w:p>
     <w:p>
       <w:r>
-        <w:t xml:space="preserve">The platform is Start From Nowhere, a test-preparation site with five adaptive exam trainers, a college and business-school rankings library, a blog, a forum, subscriptions through two payment processors, and an admin console. It was built between 2026-09-19 and 2026-09-27, which is 8 days, across 124 commits, by one owner directing a series of AI coding sessions. As of this build it is 86 Python files, 112 JavaScript files, 24 TypeScript edge functions, 35 migrations and 65 documents: 2099 tracked files in total.</w:t>
+        <w:t xml:space="preserve">The platform is Start From Nowhere, a test-preparation site with five adaptive exam trainers, a college and business-school rankings library, a blog, a forum, subscriptions through two payment processors, and an admin console. It was built between 2026-09-19 and 2026-09-27, which is 8 days, across 125 commits, by one owner directing a series of AI coding sessions. As of this build it is 86 Python files, 112 JavaScript files, 24 TypeScript edge functions, 35 migrations and 65 documents: 2099 tracked files in total.</w:t>
       </w:r>
     </w:p>
     <w:p>
@@ -5990,7 +5990,7 @@
     </w:p>
     <w:p>
       <w:r>
-        <w:t xml:space="preserve">124 commits in 8 days, one owner, a series of AI sessions. This chapter is how that was actually run, including the parts that did not work.</w:t>
+        <w:t xml:space="preserve">125 commits in 8 days, one owner, a series of AI sessions. This chapter is how that was actually run, including the parts that did not work.</w:t>
       </w:r>
     </w:p>
     <w:p>

</xml_diff>

<commit_message>
Queue "When Do GMAT, GRE, LSAT, SAT, and ACT Scores Come Out?" for November 27 (#170)
Each test maker's rule, read on September 27, 2026, with this testing year's release dates for the LSAT, the SAT and the ACT from the tables the test date pages use. ACT's two pages give different ranges, and the post says which says which. A new ACT fact and a fuller GRE one put the post's statements under the weekly source check.

Co-Authored-By: Claude Opus 5.5 <noreply@anthropic.com>
Claude-Session: https://claude.ai/code/session_01AeK5kGKjhiSCfb8FSuuhmf
</commit_message>
<xml_diff>
--- a/playbook/BUILD_PLAYBOOK.docx
+++ b/playbook/BUILD_PLAYBOOK.docx
@@ -24,7 +24,7 @@
           <w:color w:val="6B7280"/>
           <w:sz w:val="18"/>
         </w:rPr>
-        <w:t>Built 2026-09-27 from commit 847a00a. 124 commits over 8 days. This document is generated: edit docs/playbook/ and data/playbook/incidents.jsonl, then run python3 src/build_playbook.py.</w:t>
+        <w:t>Built 2026-09-27 from commit 3519ae8. 125 commits over 8 days. This document is generated: edit docs/playbook/ and data/playbook/incidents.jsonl, then run python3 src/build_playbook.py.</w:t>
       </w:r>
     </w:p>
     <w:p>
@@ -43,7 +43,7 @@
     </w:p>
     <w:p>
       <w:r>
-        <w:t xml:space="preserve">The platform is Start From Nowhere, a test-preparation site with five adaptive exam trainers, a college and business-school rankings library, a blog, a forum, subscriptions through two payment processors, and an admin console. It was built between 2026-09-19 and 2026-09-27, which is 8 days, across 124 commits, by one owner directing a series of AI coding sessions. As of this build it is 86 Python files, 112 JavaScript files, 24 TypeScript edge functions, 35 migrations and 65 documents: 2099 tracked files in total.</w:t>
+        <w:t xml:space="preserve">The platform is Start From Nowhere, a test-preparation site with five adaptive exam trainers, a college and business-school rankings library, a blog, a forum, subscriptions through two payment processors, and an admin console. It was built between 2026-09-19 and 2026-09-27, which is 8 days, across 125 commits, by one owner directing a series of AI coding sessions. As of this build it is 86 Python files, 112 JavaScript files, 24 TypeScript edge functions, 35 migrations and 65 documents: 2099 tracked files in total.</w:t>
       </w:r>
     </w:p>
     <w:p>
@@ -5990,7 +5990,7 @@
     </w:p>
     <w:p>
       <w:r>
-        <w:t xml:space="preserve">124 commits in 8 days, one owner, a series of AI sessions. This chapter is how that was actually run, including the parts that did not work.</w:t>
+        <w:t xml:space="preserve">125 commits in 8 days, one owner, a series of AI sessions. This chapter is how that was actually run, including the parts that did not work.</w:t>
       </w:r>
     </w:p>
     <w:p>

</xml_diff>

<commit_message>
Queue "How Long Are GMAT, GRE, LSAT, SAT, and ACT Scores Valid?" for November 29
Each test maker's rule, read on September 27, 2026: GMAT scores are valid for
five years and reportable for up to 10, GRE scores reportable for five years after
the test date, and LSAT scores for up to five testing years, with nothing from
before July 2021 counting for admission. Neither College Board nor ACT gives an
expiry date: College Board archives SAT scores a year after a student leaves high
school and stops testing, and ACT adds an archive fee to send scores 3 or more
years old.

New key facts for GMAT's 10-year reporting, LSAT's July 2021 cutoff and College
Board's archive rule put the post's statements under the weekly source check, and
EDITORIAL.md gains a validity block.

Co-Authored-By: Claude Opus 5.5 <noreply@anthropic.com>
Claude-Session: https://claude.ai/code/session_01AeK5kGKjhiSCfb8FSuuhmf
</commit_message>
<xml_diff>
--- a/playbook/BUILD_PLAYBOOK.docx
+++ b/playbook/BUILD_PLAYBOOK.docx
@@ -24,7 +24,7 @@
           <w:color w:val="6B7280"/>
           <w:sz w:val="18"/>
         </w:rPr>
-        <w:t>Built 2026-09-27 from commit 3519ae8. 125 commits over 8 days. This document is generated: edit docs/playbook/ and data/playbook/incidents.jsonl, then run python3 src/build_playbook.py.</w:t>
+        <w:t>Built 2026-09-27 from commit 9b9358d. 126 commits over 8 days. This document is generated: edit docs/playbook/ and data/playbook/incidents.jsonl, then run python3 src/build_playbook.py.</w:t>
       </w:r>
     </w:p>
     <w:p>
@@ -43,7 +43,7 @@
     </w:p>
     <w:p>
       <w:r>
-        <w:t xml:space="preserve">The platform is Start From Nowhere, a test-preparation site with five adaptive exam trainers, a college and business-school rankings library, a blog, a forum, subscriptions through two payment processors, and an admin console. It was built between 2026-09-19 and 2026-09-27, which is 8 days, across 125 commits, by one owner directing a series of AI coding sessions. As of this build it is 86 Python files, 112 JavaScript files, 24 TypeScript edge functions, 35 migrations and 65 documents: 2099 tracked files in total.</w:t>
+        <w:t xml:space="preserve">The platform is Start From Nowhere, a test-preparation site with five adaptive exam trainers, a college and business-school rankings library, a blog, a forum, subscriptions through two payment processors, and an admin console. It was built between 2026-09-19 and 2026-09-27, which is 8 days, across 126 commits, by one owner directing a series of AI coding sessions. As of this build it is 86 Python files, 112 JavaScript files, 24 TypeScript edge functions, 35 migrations and 65 documents: 2100 tracked files in total.</w:t>
       </w:r>
     </w:p>
     <w:p>
@@ -5990,7 +5990,7 @@
     </w:p>
     <w:p>
       <w:r>
-        <w:t xml:space="preserve">125 commits in 8 days, one owner, a series of AI sessions. This chapter is how that was actually run, including the parts that did not work.</w:t>
+        <w:t xml:space="preserve">126 commits in 8 days, one owner, a series of AI sessions. This chapter is how that was actually run, including the parts that did not work.</w:t>
       </w:r>
     </w:p>
     <w:p>

</xml_diff>

<commit_message>
Queue "How Long Are GMAT, GRE, LSAT, SAT, and ACT Scores Valid?" for November 29 (#171)
Each test maker's rule, read on September 27, 2026: GMAT scores valid for five years and reportable for up to 10, GRE scores reportable for five years, LSAT scores for up to five testing years with nothing before July 2021 counting, and no expiry date from College Board or ACT, though both charge more to send old scores. New key facts put the post's statements under the weekly source check.

Co-Authored-By: Claude Opus 5.5 <noreply@anthropic.com>
Claude-Session: https://claude.ai/code/session_01AeK5kGKjhiSCfb8FSuuhmf
</commit_message>
<xml_diff>
--- a/playbook/BUILD_PLAYBOOK.docx
+++ b/playbook/BUILD_PLAYBOOK.docx
@@ -24,7 +24,7 @@
           <w:color w:val="6B7280"/>
           <w:sz w:val="18"/>
         </w:rPr>
-        <w:t>Built 2026-09-27 from commit 3519ae8. 125 commits over 8 days. This document is generated: edit docs/playbook/ and data/playbook/incidents.jsonl, then run python3 src/build_playbook.py.</w:t>
+        <w:t>Built 2026-09-27 from commit 9b9358d. 126 commits over 8 days. This document is generated: edit docs/playbook/ and data/playbook/incidents.jsonl, then run python3 src/build_playbook.py.</w:t>
       </w:r>
     </w:p>
     <w:p>
@@ -43,7 +43,7 @@
     </w:p>
     <w:p>
       <w:r>
-        <w:t xml:space="preserve">The platform is Start From Nowhere, a test-preparation site with five adaptive exam trainers, a college and business-school rankings library, a blog, a forum, subscriptions through two payment processors, and an admin console. It was built between 2026-09-19 and 2026-09-27, which is 8 days, across 125 commits, by one owner directing a series of AI coding sessions. As of this build it is 86 Python files, 112 JavaScript files, 24 TypeScript edge functions, 35 migrations and 65 documents: 2099 tracked files in total.</w:t>
+        <w:t xml:space="preserve">The platform is Start From Nowhere, a test-preparation site with five adaptive exam trainers, a college and business-school rankings library, a blog, a forum, subscriptions through two payment processors, and an admin console. It was built between 2026-09-19 and 2026-09-27, which is 8 days, across 126 commits, by one owner directing a series of AI coding sessions. As of this build it is 86 Python files, 112 JavaScript files, 24 TypeScript edge functions, 35 migrations and 65 documents: 2100 tracked files in total.</w:t>
       </w:r>
     </w:p>
     <w:p>
@@ -5990,7 +5990,7 @@
     </w:p>
     <w:p>
       <w:r>
-        <w:t xml:space="preserve">125 commits in 8 days, one owner, a series of AI sessions. This chapter is how that was actually run, including the parts that did not work.</w:t>
+        <w:t xml:space="preserve">126 commits in 8 days, one owner, a series of AI sessions. This chapter is how that was actually run, including the parts that did not work.</w:t>
       </w:r>
     </w:p>
     <w:p>

</xml_diff>

<commit_message>
Queue "How Long Is the GMAT, GRE, LSAT, SAT, and ACT?" for December 1
Each exam's testing time and sections from the checked timing facts in
data/exams.json: the GRE about 1 hour 58 minutes, the SAT 2 hours 14, the GMAT 2
hours 15, the ACT 2 hours 45 with science (125 minutes without, the sum of its
other sections), and the LSAT about 3 hours in four 35-minute sections, for which
LSAC publishes no question counts. A table gives the average time each section
allows per question, worked out from the test makers' figures.

The blog build's Title Case check refused the first draft's "per Question"
heading, which now reads "How Much Time Does Each Question Get?".

Co-Authored-By: Claude Opus 5.5 <noreply@anthropic.com>
Claude-Session: https://claude.ai/code/session_01AeK5kGKjhiSCfb8FSuuhmf
</commit_message>
<xml_diff>
--- a/playbook/BUILD_PLAYBOOK.docx
+++ b/playbook/BUILD_PLAYBOOK.docx
@@ -24,7 +24,7 @@
           <w:color w:val="6B7280"/>
           <w:sz w:val="18"/>
         </w:rPr>
-        <w:t>Built 2026-09-27 from commit 8ef254f. 127 commits over 8 days. This document is generated: edit docs/playbook/ and data/playbook/incidents.jsonl, then run python3 src/build_playbook.py.</w:t>
+        <w:t>Built 2026-09-27 from commit 39375d2. 128 commits over 8 days. This document is generated: edit docs/playbook/ and data/playbook/incidents.jsonl, then run python3 src/build_playbook.py.</w:t>
       </w:r>
     </w:p>
     <w:p>
@@ -43,7 +43,7 @@
     </w:p>
     <w:p>
       <w:r>
-        <w:t xml:space="preserve">The platform is Start From Nowhere, a test-preparation site with five adaptive exam trainers, a college and business-school rankings library, a blog, a forum, subscriptions through two payment processors, and an admin console. It was built between 2026-09-19 and 2026-09-27, which is 8 days, across 127 commits, by one owner directing a series of AI coding sessions. As of this build it is 86 Python files, 112 JavaScript files, 24 TypeScript edge functions, 35 migrations and 65 documents: 2101 tracked files in total.</w:t>
+        <w:t xml:space="preserve">The platform is Start From Nowhere, a test-preparation site with five adaptive exam trainers, a college and business-school rankings library, a blog, a forum, subscriptions through two payment processors, and an admin console. It was built between 2026-09-19 and 2026-09-27, which is 8 days, across 128 commits, by one owner directing a series of AI coding sessions. As of this build it is 86 Python files, 112 JavaScript files, 24 TypeScript edge functions, 35 migrations and 65 documents: 2101 tracked files in total.</w:t>
       </w:r>
     </w:p>
     <w:p>
@@ -5990,7 +5990,7 @@
     </w:p>
     <w:p>
       <w:r>
-        <w:t xml:space="preserve">127 commits in 8 days, one owner, a series of AI sessions. This chapter is how that was actually run, including the parts that did not work.</w:t>
+        <w:t xml:space="preserve">128 commits in 8 days, one owner, a series of AI sessions. This chapter is how that was actually run, including the parts that did not work.</w:t>
       </w:r>
     </w:p>
     <w:p>

</xml_diff>

<commit_message>
Queue "How Long Is the GMAT, GRE, LSAT, SAT, and ACT?" for December 1 (#173)
Each exam's testing time and sections from the checked timing facts, with a table of the average time each section allows per question, worked out from the test makers' figures. The blog build's Title Case check refused the first draft's "per Question" heading.

Co-Authored-By: Claude Opus 5.5 <noreply@anthropic.com>
Claude-Session: https://claude.ai/code/session_01AeK5kGKjhiSCfb8FSuuhmf
</commit_message>
<xml_diff>
--- a/playbook/BUILD_PLAYBOOK.docx
+++ b/playbook/BUILD_PLAYBOOK.docx
@@ -24,7 +24,7 @@
           <w:color w:val="6B7280"/>
           <w:sz w:val="18"/>
         </w:rPr>
-        <w:t>Built 2026-09-27 from commit 8ef254f. 127 commits over 8 days. This document is generated: edit docs/playbook/ and data/playbook/incidents.jsonl, then run python3 src/build_playbook.py.</w:t>
+        <w:t>Built 2026-09-27 from commit 39375d2. 128 commits over 8 days. This document is generated: edit docs/playbook/ and data/playbook/incidents.jsonl, then run python3 src/build_playbook.py.</w:t>
       </w:r>
     </w:p>
     <w:p>
@@ -43,7 +43,7 @@
     </w:p>
     <w:p>
       <w:r>
-        <w:t xml:space="preserve">The platform is Start From Nowhere, a test-preparation site with five adaptive exam trainers, a college and business-school rankings library, a blog, a forum, subscriptions through two payment processors, and an admin console. It was built between 2026-09-19 and 2026-09-27, which is 8 days, across 127 commits, by one owner directing a series of AI coding sessions. As of this build it is 86 Python files, 112 JavaScript files, 24 TypeScript edge functions, 35 migrations and 65 documents: 2101 tracked files in total.</w:t>
+        <w:t xml:space="preserve">The platform is Start From Nowhere, a test-preparation site with five adaptive exam trainers, a college and business-school rankings library, a blog, a forum, subscriptions through two payment processors, and an admin console. It was built between 2026-09-19 and 2026-09-27, which is 8 days, across 128 commits, by one owner directing a series of AI coding sessions. As of this build it is 86 Python files, 112 JavaScript files, 24 TypeScript edge functions, 35 migrations and 65 documents: 2101 tracked files in total.</w:t>
       </w:r>
     </w:p>
     <w:p>
@@ -5990,7 +5990,7 @@
     </w:p>
     <w:p>
       <w:r>
-        <w:t xml:space="preserve">127 commits in 8 days, one owner, a series of AI sessions. This chapter is how that was actually run, including the parts that did not work.</w:t>
+        <w:t xml:space="preserve">128 commits in 8 days, one owner, a series of AI sessions. This chapter is how that was actually run, including the parts that did not work.</w:t>
       </w:r>
     </w:p>
     <w:p>

</xml_diff>

<commit_message>
Queue "What Are the Score Ranges for the GMAT, GRE, LSAT, SAT, and ACT?" for December 5
James Corbett's post for the December 5 drip. Each exam's scale from its
test maker's page, read on September 27, 2026: the GMAT Focus Edition's 205
to 805 with 60 to 90 sections, compared with the 10th Edition's 200 to 800
only by percentile; the GRE's three scores with no total; the LSAT's raw
score converted to 120 to 180; the SAT's sum of two 200 to 800 sections;
and the ACT's 1 to 36 Composite. It closes on what the test makers say
about comparing across exams: the ACT and SAT concordance, which ACT calls
an estimate, and GMAC's position that the GMAT is not equated with other
tests. EDITORIAL.md gains a score scales block.

INC-0181 now cites the merge that fixed it, read by the harvest's backfill.

Co-Authored-By: Claude Opus 5.5 <noreply@anthropic.com>
Claude-Session: https://claude.ai/code/session_01AeK5kGKjhiSCfb8FSuuhmf
</commit_message>
<xml_diff>
--- a/playbook/BUILD_PLAYBOOK.docx
+++ b/playbook/BUILD_PLAYBOOK.docx
@@ -24,7 +24,7 @@
           <w:color w:val="6B7280"/>
           <w:sz w:val="18"/>
         </w:rPr>
-        <w:t>Built 2026-09-27 from commit 767d7b9. 131 commits over 8 days. This document is generated: edit docs/playbook/ and data/playbook/incidents.jsonl, then run python3 src/build_playbook.py.</w:t>
+        <w:t>Built 2026-09-27 from commit 7ff6904. 132 commits over 8 days. This document is generated: edit docs/playbook/ and data/playbook/incidents.jsonl, then run python3 src/build_playbook.py.</w:t>
       </w:r>
     </w:p>
     <w:p>
@@ -43,7 +43,7 @@
     </w:p>
     <w:p>
       <w:r>
-        <w:t xml:space="preserve">The platform is Start From Nowhere, a test-preparation site with five adaptive exam trainers, a college and business-school rankings library, a blog, a forum, subscriptions through two payment processors, and an admin console. It was built between 2026-09-19 and 2026-09-27, which is 8 days, across 131 commits, by one owner directing a series of AI coding sessions. As of this build it is 86 Python files, 112 JavaScript files, 24 TypeScript edge functions, 35 migrations and 65 documents: 2103 tracked files in total.</w:t>
+        <w:t xml:space="preserve">The platform is Start From Nowhere, a test-preparation site with five adaptive exam trainers, a college and business-school rankings library, a blog, a forum, subscriptions through two payment processors, and an admin console. It was built between 2026-09-19 and 2026-09-27, which is 8 days, across 132 commits, by one owner directing a series of AI coding sessions. As of this build it is 86 Python files, 112 JavaScript files, 24 TypeScript edge functions, 35 migrations and 65 documents: 2103 tracked files in total.</w:t>
       </w:r>
     </w:p>
     <w:p>
@@ -5990,7 +5990,7 @@
     </w:p>
     <w:p>
       <w:r>
-        <w:t xml:space="preserve">131 commits in 8 days, one owner, a series of AI sessions. This chapter is how that was actually run, including the parts that did not work.</w:t>
+        <w:t xml:space="preserve">132 commits in 8 days, one owner, a series of AI sessions. This chapter is how that was actually run, including the parts that did not work.</w:t>
       </w:r>
     </w:p>
     <w:p>
@@ -25968,7 +25968,7 @@
         <w:rPr>
           <w:i/>
         </w:rPr>
-        <w:t xml:space="preserve">2026-09-27, Degraded</w:t>
+        <w:t xml:space="preserve">2026-09-27, Degraded, `7ff690443f31290b82700cd0832990934e955f57` PR #176</w:t>
       </w:r>
     </w:p>
     <w:p>

</xml_diff>

<commit_message>
Queue "Free Score Reports on the GMAT, GRE, LSAT, SAT, and ACT" for December 7
Maya Chen's post for the December 7 drip, every rule read on the test
makers' pages on September 27, 2026: five free GMAT reports within 48 hours
of the Official Score, four GRE reports on test day, none on the LSAT (a $45
law school report per application), four SAT reports until nine days after
a weekend test, and four ACT colleges named at registration, with what each
later report costs and which scores it sends.

Checking the draft against ETS's page caught a wrong claim before commit:
GRE takers view their scores at the test center before choosing, so only
the SAT's and the ACT's free reports go out before a score exists.
EDITORIAL.md gains a sending scores block.

Co-Authored-By: Claude Opus 5.5 <noreply@anthropic.com>
Claude-Session: https://claude.ai/code/session_01AeK5kGKjhiSCfb8FSuuhmf
</commit_message>
<xml_diff>
--- a/playbook/BUILD_PLAYBOOK.docx
+++ b/playbook/BUILD_PLAYBOOK.docx
@@ -24,7 +24,7 @@
           <w:color w:val="6B7280"/>
           <w:sz w:val="18"/>
         </w:rPr>
-        <w:t>Built 2026-09-27 from commit 7ff6904. 132 commits over 8 days. This document is generated: edit docs/playbook/ and data/playbook/incidents.jsonl, then run python3 src/build_playbook.py.</w:t>
+        <w:t>Built 2026-09-27 from commit 9821a1f. 133 commits over 8 days. This document is generated: edit docs/playbook/ and data/playbook/incidents.jsonl, then run python3 src/build_playbook.py.</w:t>
       </w:r>
     </w:p>
     <w:p>
@@ -43,7 +43,7 @@
     </w:p>
     <w:p>
       <w:r>
-        <w:t xml:space="preserve">The platform is Start From Nowhere, a test-preparation site with five adaptive exam trainers, a college and business-school rankings library, a blog, a forum, subscriptions through two payment processors, and an admin console. It was built between 2026-09-19 and 2026-09-27, which is 8 days, across 132 commits, by one owner directing a series of AI coding sessions. As of this build it is 86 Python files, 112 JavaScript files, 24 TypeScript edge functions, 35 migrations and 65 documents: 2103 tracked files in total.</w:t>
+        <w:t xml:space="preserve">The platform is Start From Nowhere, a test-preparation site with five adaptive exam trainers, a college and business-school rankings library, a blog, a forum, subscriptions through two payment processors, and an admin console. It was built between 2026-09-19 and 2026-09-27, which is 8 days, across 133 commits, by one owner directing a series of AI coding sessions. As of this build it is 86 Python files, 112 JavaScript files, 24 TypeScript edge functions, 35 migrations and 65 documents: 2104 tracked files in total.</w:t>
       </w:r>
     </w:p>
     <w:p>
@@ -5990,7 +5990,7 @@
     </w:p>
     <w:p>
       <w:r>
-        <w:t xml:space="preserve">132 commits in 8 days, one owner, a series of AI sessions. This chapter is how that was actually run, including the parts that did not work.</w:t>
+        <w:t xml:space="preserve">133 commits in 8 days, one owner, a series of AI sessions. This chapter is how that was actually run, including the parts that did not work.</w:t>
       </w:r>
     </w:p>
     <w:p>

</xml_diff>

<commit_message>
Queue "Can You Use a Calculator on the GMAT, GRE, LSAT, SAT, and ACT?" for December 9
Sarah Whitfield's post for the December 9 drip, every rule read on the
test makers' pages on September 27, 2026: the GMAT's on-screen calculator
in Data Insights only, the GRE's on-screen calculator in Quant, none on the
LSAT, and the SAT's and ACT's rules for Desmos and handheld models on math
only, with each one's prohibited computer algebra models. EDITORIAL.md
gains a calculators block.

The post planned for this slot, on cancelling scores, is held: GMAC's
cancellation article is on support.mba.com, which Cloudflare refused all
day, and no GMAC page that could be read states the rule.

Co-Authored-By: Claude Opus 5.5 <noreply@anthropic.com>
Claude-Session: https://claude.ai/code/session_01AeK5kGKjhiSCfb8FSuuhmf
</commit_message>
<xml_diff>
--- a/playbook/BUILD_PLAYBOOK.docx
+++ b/playbook/BUILD_PLAYBOOK.docx
@@ -24,7 +24,7 @@
           <w:color w:val="6B7280"/>
           <w:sz w:val="18"/>
         </w:rPr>
-        <w:t>Built 2026-09-27 from commit 9821a1f. 133 commits over 8 days. This document is generated: edit docs/playbook/ and data/playbook/incidents.jsonl, then run python3 src/build_playbook.py.</w:t>
+        <w:t>Built 2026-09-27 from commit 37e1c44. 133 commits over 8 days. This document is generated: edit docs/playbook/ and data/playbook/incidents.jsonl, then run python3 src/build_playbook.py.</w:t>
       </w:r>
     </w:p>
     <w:p>
@@ -43,7 +43,7 @@
     </w:p>
     <w:p>
       <w:r>
-        <w:t xml:space="preserve">The platform is Start From Nowhere, a test-preparation site with five adaptive exam trainers, a college and business-school rankings library, a blog, a forum, subscriptions through two payment processors, and an admin console. It was built between 2026-09-19 and 2026-09-27, which is 8 days, across 133 commits, by one owner directing a series of AI coding sessions. As of this build it is 86 Python files, 112 JavaScript files, 24 TypeScript edge functions, 35 migrations and 65 documents: 2104 tracked files in total.</w:t>
+        <w:t xml:space="preserve">The platform is Start From Nowhere, a test-preparation site with five adaptive exam trainers, a college and business-school rankings library, a blog, a forum, subscriptions through two payment processors, and an admin console. It was built between 2026-09-19 and 2026-09-27, which is 8 days, across 133 commits, by one owner directing a series of AI coding sessions. As of this build it is 86 Python files, 112 JavaScript files, 24 TypeScript edge functions, 35 migrations and 65 documents: 2105 tracked files in total.</w:t>
       </w:r>
     </w:p>
     <w:p>

</xml_diff>

<commit_message>
Queue "Can You Use a Calculator on the GMAT, GRE, LSAT, SAT, and ACT?" for December 9 (#178)
Sarah Whitfield's post for the December 9 drip, every rule read on the
test makers' pages on September 27, 2026: the GMAT's on-screen calculator
in Data Insights only, the GRE's on-screen calculator in Quant, none on the
LSAT, and the SAT's and ACT's rules for Desmos and handheld models on math
only, with each one's prohibited computer algebra models. EDITORIAL.md
gains a calculators block.

The post planned for this slot, on cancelling scores, is held: GMAC's
cancellation article is on support.mba.com, which Cloudflare refused all
day, and no GMAC page that could be read states the rule.


Claude-Session: https://claude.ai/code/session_01AeK5kGKjhiSCfb8FSuuhmf

Co-authored-by: Claude <noreply@anthropic.com>
</commit_message>
<xml_diff>
--- a/playbook/BUILD_PLAYBOOK.docx
+++ b/playbook/BUILD_PLAYBOOK.docx
@@ -24,7 +24,7 @@
           <w:color w:val="6B7280"/>
           <w:sz w:val="18"/>
         </w:rPr>
-        <w:t>Built 2026-09-27 from commit 9821a1f. 133 commits over 8 days. This document is generated: edit docs/playbook/ and data/playbook/incidents.jsonl, then run python3 src/build_playbook.py.</w:t>
+        <w:t>Built 2026-09-27 from commit 37e1c44. 133 commits over 8 days. This document is generated: edit docs/playbook/ and data/playbook/incidents.jsonl, then run python3 src/build_playbook.py.</w:t>
       </w:r>
     </w:p>
     <w:p>
@@ -43,7 +43,7 @@
     </w:p>
     <w:p>
       <w:r>
-        <w:t xml:space="preserve">The platform is Start From Nowhere, a test-preparation site with five adaptive exam trainers, a college and business-school rankings library, a blog, a forum, subscriptions through two payment processors, and an admin console. It was built between 2026-09-19 and 2026-09-27, which is 8 days, across 133 commits, by one owner directing a series of AI coding sessions. As of this build it is 86 Python files, 112 JavaScript files, 24 TypeScript edge functions, 35 migrations and 65 documents: 2104 tracked files in total.</w:t>
+        <w:t xml:space="preserve">The platform is Start From Nowhere, a test-preparation site with five adaptive exam trainers, a college and business-school rankings library, a blog, a forum, subscriptions through two payment processors, and an admin console. It was built between 2026-09-19 and 2026-09-27, which is 8 days, across 133 commits, by one owner directing a series of AI coding sessions. As of this build it is 86 Python files, 112 JavaScript files, 24 TypeScript edge functions, 35 migrations and 65 documents: 2105 tracked files in total.</w:t>
       </w:r>
     </w:p>
     <w:p>

</xml_diff>

<commit_message>
Queue "What's on Your GMAT, GRE, LSAT, SAT, or ACT Score Report?" for December 31 (#201)
Sarah Whitfield's post for December 31 covers what each score report shows beyond the score, and what the schools a test taker sends it to receive. data/exams.json gains seven facts from GMAC's help center, ETS's get-scores page, LSAC's scoring page, College Board's What Do My Scores Mean? and ACT's understanding scores page; all seven pass the source check's functions against their live pages. EDITORIAL.md gains a score report block and ROADMAP.md records the post.

Co-Authored-By: Claude Opus 5.5 <noreply@anthropic.com>
Claude-Session: https://claude.ai/code/session_01AeK5kGKjhiSCfb8FSuuhmf
</commit_message>
<xml_diff>
--- a/playbook/BUILD_PLAYBOOK.docx
+++ b/playbook/BUILD_PLAYBOOK.docx
@@ -24,7 +24,7 @@
           <w:color w:val="6B7280"/>
           <w:sz w:val="18"/>
         </w:rPr>
-        <w:t>Built 2026-09-28 from commit 7dc1391. 154 commits over 9 days. This document is generated: edit docs/playbook/ and data/playbook/incidents.jsonl, then run python3 src/build_playbook.py.</w:t>
+        <w:t>Built 2026-09-28 from commit 6e6e775. 155 commits over 9 days. This document is generated: edit docs/playbook/ and data/playbook/incidents.jsonl, then run python3 src/build_playbook.py.</w:t>
       </w:r>
     </w:p>
     <w:p>
@@ -43,7 +43,7 @@
     </w:p>
     <w:p>
       <w:r>
-        <w:t xml:space="preserve">The platform is Start From Nowhere, a test-preparation site with five adaptive exam trainers, a college and business-school rankings library, a blog, a forum, subscriptions through two payment processors, and an admin console. It was built between 2026-09-19 and 2026-09-28, which is 9 days, across 154 commits, by one owner directing a series of AI coding sessions. As of this build it is 86 Python files, 112 JavaScript files, 24 TypeScript edge functions, 35 migrations and 65 documents: 2116 tracked files in total.</w:t>
+        <w:t xml:space="preserve">The platform is Start From Nowhere, a test-preparation site with five adaptive exam trainers, a college and business-school rankings library, a blog, a forum, subscriptions through two payment processors, and an admin console. It was built between 2026-09-19 and 2026-09-28, which is 9 days, across 155 commits, by one owner directing a series of AI coding sessions. As of this build it is 86 Python files, 112 JavaScript files, 24 TypeScript edge functions, 35 migrations and 65 documents: 2116 tracked files in total.</w:t>
       </w:r>
     </w:p>
     <w:p>
@@ -5990,7 +5990,7 @@
     </w:p>
     <w:p>
       <w:r>
-        <w:t xml:space="preserve">154 commits in 9 days, one owner, a series of AI sessions. This chapter is how that was actually run, including the parts that did not work.</w:t>
+        <w:t xml:space="preserve">155 commits in 9 days, one owner, a series of AI sessions. This chapter is how that was actually run, including the parts that did not work.</w:t>
       </w:r>
     </w:p>
     <w:p>

</xml_diff>

<commit_message>
Queue "Does the GMAT, GRE, LSAT, SAT, or ACT Have an Essay?" for January 6
James Corbett's post for the January 6 drip: only the GRE scores an essay at
every sitting (one Analyze an Issue task, 30 minutes, always first); the LSAT
requires an unscored Argumentative Writing sample, 15 minutes of prewriting and
35 to write, taken remotely, before scores are released; the ACT's 40 minute
essay is optional and scored 2 to 12; the SAT Essay survives only on school
days in states that require it; and the GMAT Focus Edition has none.

Every rule was read on September 28 from the test makers' own pages. Three
join data/exams.json (the LSAT writing timing, the SAT Essay's school day
availability and the ACT writing score scale) and pass the source check's
functions, and EDITORIAL.md gains an essay block. The ledger backfill records
INC-0192's commit and pull request.

Co-Authored-By: Claude Opus 5.5 <noreply@anthropic.com>
Claude-Session: https://claude.ai/code/session_01AeK5kGKjhiSCfb8FSuuhmf
</commit_message>
<xml_diff>
--- a/playbook/BUILD_PLAYBOOK.docx
+++ b/playbook/BUILD_PLAYBOOK.docx
@@ -24,7 +24,7 @@
           <w:color w:val="6B7280"/>
           <w:sz w:val="18"/>
         </w:rPr>
-        <w:t>Built 2026-09-28 from commit a378688. 159 commits over 9 days. This document is generated: edit docs/playbook/ and data/playbook/incidents.jsonl, then run python3 src/build_playbook.py.</w:t>
+        <w:t>Built 2026-09-29 from commit c31bd4b. 160 commits over 9 days. This document is generated: edit docs/playbook/ and data/playbook/incidents.jsonl, then run python3 src/build_playbook.py.</w:t>
       </w:r>
     </w:p>
     <w:p>
@@ -43,7 +43,7 @@
     </w:p>
     <w:p>
       <w:r>
-        <w:t xml:space="preserve">The platform is Start From Nowhere, a test-preparation site with five adaptive exam trainers, a college and business-school rankings library, a blog, a forum, subscriptions through two payment processors, and an admin console. It was built between 2026-09-19 and 2026-09-28, which is 9 days, across 159 commits, by one owner directing a series of AI coding sessions. As of this build it is 86 Python files, 112 JavaScript files, 24 TypeScript edge functions, 35 migrations and 65 documents: 2119 tracked files in total.</w:t>
+        <w:t xml:space="preserve">The platform is Start From Nowhere, a test-preparation site with five adaptive exam trainers, a college and business-school rankings library, a blog, a forum, subscriptions through two payment processors, and an admin console. It was built between 2026-09-19 and 2026-09-28, which is 9 days, across 160 commits, by one owner directing a series of AI coding sessions. As of this build it is 86 Python files, 112 JavaScript files, 24 TypeScript edge functions, 35 migrations and 65 documents: 2119 tracked files in total.</w:t>
       </w:r>
     </w:p>
     <w:p>
@@ -5990,7 +5990,7 @@
     </w:p>
     <w:p>
       <w:r>
-        <w:t xml:space="preserve">159 commits in 9 days, one owner, a series of AI sessions. This chapter is how that was actually run, including the parts that did not work.</w:t>
+        <w:t xml:space="preserve">160 commits in 9 days, one owner, a series of AI sessions. This chapter is how that was actually run, including the parts that did not work.</w:t>
       </w:r>
     </w:p>
     <w:p>
@@ -22663,7 +22663,7 @@
         <w:rPr>
           <w:i/>
         </w:rPr>
-        <w:t xml:space="preserve">2026-09-28, Degraded</w:t>
+        <w:t xml:space="preserve">2026-09-28, Degraded, `c31bd4b5ac0d1c82271aaba1d7dc0bf99361f363` PR #205</w:t>
       </w:r>
     </w:p>
     <w:p>

</xml_diff>

<commit_message>
Queue "Does the GMAT, GRE, LSAT, SAT, or ACT Have an Essay?" for January 6 (#206)
James Corbett's post for the January 6 drip: only the GRE scores an essay at
every sitting (one Analyze an Issue task, 30 minutes, always first); the LSAT
requires an unscored Argumentative Writing sample, 15 minutes of prewriting and
35 to write, taken remotely, before scores are released; the ACT's 40 minute
essay is optional and scored 2 to 12; the SAT Essay survives only on school
days in states that require it; and the GMAT Focus Edition has none.

Every rule was read on September 28 from the test makers' own pages. Three
join data/exams.json (the LSAT writing timing, the SAT Essay's school day
availability and the ACT writing score scale) and pass the source check's
functions, and EDITORIAL.md gains an essay block. The ledger backfill records
INC-0192's commit and pull request.


Claude-Session: https://claude.ai/code/session_01AeK5kGKjhiSCfb8FSuuhmf

Co-authored-by: Claude <noreply@anthropic.com>
</commit_message>
<xml_diff>
--- a/playbook/BUILD_PLAYBOOK.docx
+++ b/playbook/BUILD_PLAYBOOK.docx
@@ -24,7 +24,7 @@
           <w:color w:val="6B7280"/>
           <w:sz w:val="18"/>
         </w:rPr>
-        <w:t>Built 2026-09-28 from commit a378688. 159 commits over 9 days. This document is generated: edit docs/playbook/ and data/playbook/incidents.jsonl, then run python3 src/build_playbook.py.</w:t>
+        <w:t>Built 2026-09-29 from commit c31bd4b. 160 commits over 9 days. This document is generated: edit docs/playbook/ and data/playbook/incidents.jsonl, then run python3 src/build_playbook.py.</w:t>
       </w:r>
     </w:p>
     <w:p>
@@ -43,7 +43,7 @@
     </w:p>
     <w:p>
       <w:r>
-        <w:t xml:space="preserve">The platform is Start From Nowhere, a test-preparation site with five adaptive exam trainers, a college and business-school rankings library, a blog, a forum, subscriptions through two payment processors, and an admin console. It was built between 2026-09-19 and 2026-09-28, which is 9 days, across 159 commits, by one owner directing a series of AI coding sessions. As of this build it is 86 Python files, 112 JavaScript files, 24 TypeScript edge functions, 35 migrations and 65 documents: 2119 tracked files in total.</w:t>
+        <w:t xml:space="preserve">The platform is Start From Nowhere, a test-preparation site with five adaptive exam trainers, a college and business-school rankings library, a blog, a forum, subscriptions through two payment processors, and an admin console. It was built between 2026-09-19 and 2026-09-28, which is 9 days, across 160 commits, by one owner directing a series of AI coding sessions. As of this build it is 86 Python files, 112 JavaScript files, 24 TypeScript edge functions, 35 migrations and 65 documents: 2119 tracked files in total.</w:t>
       </w:r>
     </w:p>
     <w:p>
@@ -5990,7 +5990,7 @@
     </w:p>
     <w:p>
       <w:r>
-        <w:t xml:space="preserve">159 commits in 9 days, one owner, a series of AI sessions. This chapter is how that was actually run, including the parts that did not work.</w:t>
+        <w:t xml:space="preserve">160 commits in 9 days, one owner, a series of AI sessions. This chapter is how that was actually run, including the parts that did not work.</w:t>
       </w:r>
     </w:p>
     <w:p>
@@ -22663,7 +22663,7 @@
         <w:rPr>
           <w:i/>
         </w:rPr>
-        <w:t xml:space="preserve">2026-09-28, Degraded</w:t>
+        <w:t xml:space="preserve">2026-09-28, Degraded, `c31bd4b5ac0d1c82271aaba1d7dc0bf99361f363` PR #205</w:t>
       </w:r>
     </w:p>
     <w:p>

</xml_diff>

<commit_message>
Show schools' own words on choosing a round, read back weekly
24 sentences from 13 programs' deadline pages, on student visas, merit
funding, reapplying and which round is the last, each found word for word
on its page on October 6 and stored as the page prints it, with the
page's heading where it names an audience ("Reapplicants"). School pages
print them under "In the School's Own Words" below the deadlines table.

validate_schools refuses a fragment, a duplicate, a dash and an unknown
key in a deadlines record. The weekly source check reads every sentence
back with the dates, spacing and the shape of quotation marks aside; its
self-check covers a sentence found, one reworded and a dropped heading.
All 13 pages read clean, so Wharton's, Tuck's and Stanford GSB's records
move their read date to October 6. The ledger cites PR 237 for INC-0203
and INC-0204.

Co-Authored-By: Claude Opus 5.5 <noreply@anthropic.com>
Claude-Session: https://claude.ai/code/session_01AeK5kGKjhiSCfb8FSuuhmf
</commit_message>
<xml_diff>
--- a/playbook/BUILD_PLAYBOOK.docx
+++ b/playbook/BUILD_PLAYBOOK.docx
@@ -24,7 +24,7 @@
           <w:color w:val="6B7280"/>
           <w:sz w:val="18"/>
         </w:rPr>
-        <w:t>Built 2026-10-06 from commit 51b09fe. 189 commits over 16 days. This document is generated: edit docs/playbook/ and data/playbook/incidents.jsonl, then run python3 src/build_playbook.py.</w:t>
+        <w:t>Built 2026-10-06 from commit c13caeb. 190 commits over 16 days. This document is generated: edit docs/playbook/ and data/playbook/incidents.jsonl, then run python3 src/build_playbook.py.</w:t>
       </w:r>
     </w:p>
     <w:p>
@@ -43,7 +43,7 @@
     </w:p>
     <w:p>
       <w:r>
-        <w:t xml:space="preserve">The platform is Start From Nowhere, a test-preparation site with five adaptive exam trainers, a college and business-school rankings library, a blog, a forum, subscriptions through two payment processors, and an admin console. It was built between 2026-09-19 and 2026-10-05, which is 16 days, across 189 commits, by one owner directing a series of AI coding sessions. As of this build it is 87 Python files, 112 JavaScript files, 24 TypeScript edge functions, 35 migrations and 65 documents: 2125 tracked files in total.</w:t>
+        <w:t xml:space="preserve">The platform is Start From Nowhere, a test-preparation site with five adaptive exam trainers, a college and business-school rankings library, a blog, a forum, subscriptions through two payment processors, and an admin console. It was built between 2026-09-19 and 2026-10-05, which is 16 days, across 190 commits, by one owner directing a series of AI coding sessions. As of this build it is 87 Python files, 112 JavaScript files, 24 TypeScript edge functions, 35 migrations and 65 documents: 2126 tracked files in total.</w:t>
       </w:r>
     </w:p>
     <w:p>
@@ -5990,7 +5990,7 @@
     </w:p>
     <w:p>
       <w:r>
-        <w:t xml:space="preserve">189 commits in 16 days, one owner, a series of AI sessions. This chapter is how that was actually run, including the parts that did not work.</w:t>
+        <w:t xml:space="preserve">190 commits in 16 days, one owner, a series of AI sessions. This chapter is how that was actually run, including the parts that did not work.</w:t>
       </w:r>
     </w:p>
     <w:p>
@@ -23378,7 +23378,7 @@
         <w:rPr>
           <w:i/>
         </w:rPr>
-        <w:t xml:space="preserve">2026-10-06, Wrong data shown or stored</w:t>
+        <w:t xml:space="preserve">2026-10-06, Wrong data shown or stored, `c13caebbded421c36f84b1a7a9438ab334d282d6` PR #237</w:t>
       </w:r>
     </w:p>
     <w:p>
@@ -32254,7 +32254,7 @@
         <w:rPr>
           <w:i/>
         </w:rPr>
-        <w:t xml:space="preserve">2026-10-06, Degraded</w:t>
+        <w:t xml:space="preserve">2026-10-06, Degraded, `c13caebbded421c36f84b1a7a9438ab334d282d6` PR #237</w:t>
       </w:r>
     </w:p>
     <w:p>

</xml_diff>

<commit_message>
Show schools' own words on choosing a round, read back weekly (#238)
24 sentences from 13 programs' deadline pages, on student visas, merit
funding, reapplying and which round is the last, each found word for word
on its page on October 6 and stored as the page prints it, with the
page's heading where it names an audience ("Reapplicants"). School pages
print them under "In the School's Own Words" below the deadlines table.

validate_schools refuses a fragment, a duplicate, a dash and an unknown
key in a deadlines record. The weekly source check reads every sentence
back with the dates, spacing and the shape of quotation marks aside; its
self-check covers a sentence found, one reworded and a dropped heading.
All 13 pages read clean, so Wharton's, Tuck's and Stanford GSB's records
move their read date to October 6. The ledger cites PR 237 for INC-0203
and INC-0204.


Claude-Session: https://claude.ai/code/session_01AeK5kGKjhiSCfb8FSuuhmf

Co-authored-by: Claude <noreply@anthropic.com>
</commit_message>
<xml_diff>
--- a/playbook/BUILD_PLAYBOOK.docx
+++ b/playbook/BUILD_PLAYBOOK.docx
@@ -24,7 +24,7 @@
           <w:color w:val="6B7280"/>
           <w:sz w:val="18"/>
         </w:rPr>
-        <w:t>Built 2026-10-06 from commit 51b09fe. 189 commits over 16 days. This document is generated: edit docs/playbook/ and data/playbook/incidents.jsonl, then run python3 src/build_playbook.py.</w:t>
+        <w:t>Built 2026-10-06 from commit c13caeb. 190 commits over 16 days. This document is generated: edit docs/playbook/ and data/playbook/incidents.jsonl, then run python3 src/build_playbook.py.</w:t>
       </w:r>
     </w:p>
     <w:p>
@@ -43,7 +43,7 @@
     </w:p>
     <w:p>
       <w:r>
-        <w:t xml:space="preserve">The platform is Start From Nowhere, a test-preparation site with five adaptive exam trainers, a college and business-school rankings library, a blog, a forum, subscriptions through two payment processors, and an admin console. It was built between 2026-09-19 and 2026-10-05, which is 16 days, across 189 commits, by one owner directing a series of AI coding sessions. As of this build it is 87 Python files, 112 JavaScript files, 24 TypeScript edge functions, 35 migrations and 65 documents: 2125 tracked files in total.</w:t>
+        <w:t xml:space="preserve">The platform is Start From Nowhere, a test-preparation site with five adaptive exam trainers, a college and business-school rankings library, a blog, a forum, subscriptions through two payment processors, and an admin console. It was built between 2026-09-19 and 2026-10-05, which is 16 days, across 190 commits, by one owner directing a series of AI coding sessions. As of this build it is 87 Python files, 112 JavaScript files, 24 TypeScript edge functions, 35 migrations and 65 documents: 2126 tracked files in total.</w:t>
       </w:r>
     </w:p>
     <w:p>
@@ -5990,7 +5990,7 @@
     </w:p>
     <w:p>
       <w:r>
-        <w:t xml:space="preserve">189 commits in 16 days, one owner, a series of AI sessions. This chapter is how that was actually run, including the parts that did not work.</w:t>
+        <w:t xml:space="preserve">190 commits in 16 days, one owner, a series of AI sessions. This chapter is how that was actually run, including the parts that did not work.</w:t>
       </w:r>
     </w:p>
     <w:p>
@@ -23378,7 +23378,7 @@
         <w:rPr>
           <w:i/>
         </w:rPr>
-        <w:t xml:space="preserve">2026-10-06, Wrong data shown or stored</w:t>
+        <w:t xml:space="preserve">2026-10-06, Wrong data shown or stored, `c13caebbded421c36f84b1a7a9438ab334d282d6` PR #237</w:t>
       </w:r>
     </w:p>
     <w:p>
@@ -32254,7 +32254,7 @@
         <w:rPr>
           <w:i/>
         </w:rPr>
-        <w:t xml:space="preserve">2026-10-06, Degraded</w:t>
+        <w:t xml:space="preserve">2026-10-06, Degraded, `c13caebbded421c36f84b1a7a9438ab334d282d6` PR #237</w:t>
       </w:r>
     </w:p>
     <w:p>

</xml_diff>

<commit_message>
Add ten LSAT argument structure arguments (60 items)
Ten new arguments, each giving five role questions and a main
conclusion question: a council pool's winter closing, a vineyard's hand
harvest, an island's early ferry, a vet practice's weekend surgery, a
planetarium's live shows, a youth team's pitch size, a hotel's
restaurant, a choir's spring concert, spraying an allotment site and an
old stone bridge.

The answer bias guard (INC-0079) stopped the first build: the main
conclusion was the shortest choice in six of the ten. Nine conclusion
paraphrases were reworded so the key sits across the length ranks, each
still saying only what the conclusion says. All 60 items were read.

The category grows from 300 to 360 items and the LSAT bank to 15853, of
which 15481 are generated, counts read from the build.

Co-Authored-By: Claude Opus 5.5 <noreply@anthropic.com>
Claude-Session: https://claude.ai/code/session_01AeK5kGKjhiSCfb8FSuuhmf
</commit_message>
<xml_diff>
--- a/playbook/BUILD_PLAYBOOK.docx
+++ b/playbook/BUILD_PLAYBOOK.docx
@@ -24,7 +24,7 @@
           <w:color w:val="6B7280"/>
           <w:sz w:val="18"/>
         </w:rPr>
-        <w:t>Built 2026-10-06 from commit c13caeb. 190 commits over 16 days. This document is generated: edit docs/playbook/ and data/playbook/incidents.jsonl, then run python3 src/build_playbook.py.</w:t>
+        <w:t>Built 2026-10-06 from commit 4aa50f1. 191 commits over 16 days. This document is generated: edit docs/playbook/ and data/playbook/incidents.jsonl, then run python3 src/build_playbook.py.</w:t>
       </w:r>
     </w:p>
     <w:p>
@@ -43,7 +43,7 @@
     </w:p>
     <w:p>
       <w:r>
-        <w:t xml:space="preserve">The platform is Start From Nowhere, a test-preparation site with five adaptive exam trainers, a college and business-school rankings library, a blog, a forum, subscriptions through two payment processors, and an admin console. It was built between 2026-09-19 and 2026-10-05, which is 16 days, across 190 commits, by one owner directing a series of AI coding sessions. As of this build it is 87 Python files, 112 JavaScript files, 24 TypeScript edge functions, 35 migrations and 65 documents: 2126 tracked files in total.</w:t>
+        <w:t xml:space="preserve">The platform is Start From Nowhere, a test-preparation site with five adaptive exam trainers, a college and business-school rankings library, a blog, a forum, subscriptions through two payment processors, and an admin console. It was built between 2026-09-19 and 2026-10-05, which is 16 days, across 191 commits, by one owner directing a series of AI coding sessions. As of this build it is 87 Python files, 112 JavaScript files, 24 TypeScript edge functions, 35 migrations and 65 documents: 2126 tracked files in total.</w:t>
       </w:r>
     </w:p>
     <w:p>
@@ -5990,7 +5990,7 @@
     </w:p>
     <w:p>
       <w:r>
-        <w:t xml:space="preserve">190 commits in 16 days, one owner, a series of AI sessions. This chapter is how that was actually run, including the parts that did not work.</w:t>
+        <w:t xml:space="preserve">191 commits in 16 days, one owner, a series of AI sessions. This chapter is how that was actually run, including the parts that did not work.</w:t>
       </w:r>
     </w:p>
     <w:p>

</xml_diff>

<commit_message>
Add ten LSAT argument structure arguments (60 items) (#239)
Ten new arguments, each giving five role questions and a main
conclusion question: a council pool's winter closing, a vineyard's hand
harvest, an island's early ferry, a vet practice's weekend surgery, a
planetarium's live shows, a youth team's pitch size, a hotel's
restaurant, a choir's spring concert, spraying an allotment site and an
old stone bridge.

The answer bias guard (INC-0079) stopped the first build: the main
conclusion was the shortest choice in six of the ten. Nine conclusion
paraphrases were reworded so the key sits across the length ranks, each
still saying only what the conclusion says. All 60 items were read.

The category grows from 300 to 360 items and the LSAT bank to 15853, of
which 15481 are generated, counts read from the build.


Claude-Session: https://claude.ai/code/session_01AeK5kGKjhiSCfb8FSuuhmf

Co-authored-by: Claude <noreply@anthropic.com>
</commit_message>
<xml_diff>
--- a/playbook/BUILD_PLAYBOOK.docx
+++ b/playbook/BUILD_PLAYBOOK.docx
@@ -24,7 +24,7 @@
           <w:color w:val="6B7280"/>
           <w:sz w:val="18"/>
         </w:rPr>
-        <w:t>Built 2026-10-06 from commit c13caeb. 190 commits over 16 days. This document is generated: edit docs/playbook/ and data/playbook/incidents.jsonl, then run python3 src/build_playbook.py.</w:t>
+        <w:t>Built 2026-10-06 from commit 4aa50f1. 191 commits over 16 days. This document is generated: edit docs/playbook/ and data/playbook/incidents.jsonl, then run python3 src/build_playbook.py.</w:t>
       </w:r>
     </w:p>
     <w:p>
@@ -43,7 +43,7 @@
     </w:p>
     <w:p>
       <w:r>
-        <w:t xml:space="preserve">The platform is Start From Nowhere, a test-preparation site with five adaptive exam trainers, a college and business-school rankings library, a blog, a forum, subscriptions through two payment processors, and an admin console. It was built between 2026-09-19 and 2026-10-05, which is 16 days, across 190 commits, by one owner directing a series of AI coding sessions. As of this build it is 87 Python files, 112 JavaScript files, 24 TypeScript edge functions, 35 migrations and 65 documents: 2126 tracked files in total.</w:t>
+        <w:t xml:space="preserve">The platform is Start From Nowhere, a test-preparation site with five adaptive exam trainers, a college and business-school rankings library, a blog, a forum, subscriptions through two payment processors, and an admin console. It was built between 2026-09-19 and 2026-10-05, which is 16 days, across 191 commits, by one owner directing a series of AI coding sessions. As of this build it is 87 Python files, 112 JavaScript files, 24 TypeScript edge functions, 35 migrations and 65 documents: 2126 tracked files in total.</w:t>
       </w:r>
     </w:p>
     <w:p>
@@ -5990,7 +5990,7 @@
     </w:p>
     <w:p>
       <w:r>
-        <w:t xml:space="preserve">190 commits in 16 days, one owner, a series of AI sessions. This chapter is how that was actually run, including the parts that did not work.</w:t>
+        <w:t xml:space="preserve">191 commits in 16 days, one owner, a series of AI sessions. This chapter is how that was actually run, including the parts that did not work.</w:t>
       </w:r>
     </w:p>
     <w:p>

</xml_diff>

<commit_message>
Queue the GRE question types hub for March 5, and backfill INC-0207
"GRE Question Types: Verbal, Quant and the Essay" (March 5) is the hub
for the GRE series: ETS's question count and time for each of the five
sections from the Test Structure page (read October 6, 2026), the three
Verbal and four Quantitative question types with each type's name
linking to its guide, and the essay task. EDITORIAL.md's GRE Quantitative
fact line gains the two sections' counts and times.

Also backfills INC-0207 with its commit and PR.

Co-Authored-By: Claude Opus 5.5 <noreply@anthropic.com>
Claude-Session: https://claude.ai/code/session_01AeK5kGKjhiSCfb8FSuuhmf
</commit_message>
<xml_diff>
--- a/playbook/BUILD_PLAYBOOK.docx
+++ b/playbook/BUILD_PLAYBOOK.docx
@@ -24,7 +24,7 @@
           <w:color w:val="6B7280"/>
           <w:sz w:val="18"/>
         </w:rPr>
-        <w:t>Built 2026-10-06 from commit c60717a. 215 commits over 17 days. This document is generated: edit docs/playbook/ and data/playbook/incidents.jsonl, then run python3 src/build_playbook.py.</w:t>
+        <w:t>Built 2026-10-06 from commit ef7a4c4. 216 commits over 17 days. This document is generated: edit docs/playbook/ and data/playbook/incidents.jsonl, then run python3 src/build_playbook.py.</w:t>
       </w:r>
     </w:p>
     <w:p>
@@ -43,7 +43,7 @@
     </w:p>
     <w:p>
       <w:r>
-        <w:t xml:space="preserve">The platform is Start From Nowhere, a test-preparation site with five adaptive exam trainers, a college and business-school rankings library, a blog, a forum, subscriptions through two payment processors, and an admin console. It was built between 2026-09-19 and 2026-10-06, which is 17 days, across 215 commits, by one owner directing a series of AI coding sessions. As of this build it is 88 Python files, 112 JavaScript files, 24 TypeScript edge functions, 35 migrations and 65 documents: 2151 tracked files in total.</w:t>
+        <w:t xml:space="preserve">The platform is Start From Nowhere, a test-preparation site with five adaptive exam trainers, a college and business-school rankings library, a blog, a forum, subscriptions through two payment processors, and an admin console. It was built between 2026-09-19 and 2026-10-06, which is 17 days, across 216 commits, by one owner directing a series of AI coding sessions. As of this build it is 88 Python files, 112 JavaScript files, 24 TypeScript edge functions, 35 migrations and 65 documents: 2151 tracked files in total.</w:t>
       </w:r>
     </w:p>
     <w:p>
@@ -5990,7 +5990,7 @@
     </w:p>
     <w:p>
       <w:r>
-        <w:t xml:space="preserve">215 commits in 17 days, one owner, a series of AI sessions. This chapter is how that was actually run, including the parts that did not work.</w:t>
+        <w:t xml:space="preserve">216 commits in 17 days, one owner, a series of AI sessions. This chapter is how that was actually run, including the parts that did not work.</w:t>
       </w:r>
     </w:p>
     <w:p>
@@ -23562,7 +23562,7 @@
         <w:rPr>
           <w:i/>
         </w:rPr>
-        <w:t xml:space="preserve">2026-10-06, Wrong data shown or stored</w:t>
+        <w:t xml:space="preserve">2026-10-06, Wrong data shown or stored, `ef7a4c49bd4ab68eb05bf16d1fc55f1d1464d785` PR #263</w:t>
       </w:r>
     </w:p>
     <w:p>

</xml_diff>

<commit_message>
Queue the GRE question types hub for March 5, and backfill INC-0207 (#264)
"GRE Question Types: Verbal, Quant and the Essay" (March 5) is the hub
for the GRE series: ETS's question count and time for each of the five
sections from the Test Structure page (read October 6, 2026), the three
Verbal and four Quantitative question types with each type's name
linking to its guide, and the essay task. EDITORIAL.md's GRE Quantitative
fact line gains the two sections' counts and times.

Also backfills INC-0207 with its commit and PR.


Claude-Session: https://claude.ai/code/session_01AeK5kGKjhiSCfb8FSuuhmf

Co-authored-by: Claude <noreply@anthropic.com>
</commit_message>
<xml_diff>
--- a/playbook/BUILD_PLAYBOOK.docx
+++ b/playbook/BUILD_PLAYBOOK.docx
@@ -24,7 +24,7 @@
           <w:color w:val="6B7280"/>
           <w:sz w:val="18"/>
         </w:rPr>
-        <w:t>Built 2026-10-06 from commit c60717a. 215 commits over 17 days. This document is generated: edit docs/playbook/ and data/playbook/incidents.jsonl, then run python3 src/build_playbook.py.</w:t>
+        <w:t>Built 2026-10-06 from commit ef7a4c4. 216 commits over 17 days. This document is generated: edit docs/playbook/ and data/playbook/incidents.jsonl, then run python3 src/build_playbook.py.</w:t>
       </w:r>
     </w:p>
     <w:p>
@@ -43,7 +43,7 @@
     </w:p>
     <w:p>
       <w:r>
-        <w:t xml:space="preserve">The platform is Start From Nowhere, a test-preparation site with five adaptive exam trainers, a college and business-school rankings library, a blog, a forum, subscriptions through two payment processors, and an admin console. It was built between 2026-09-19 and 2026-10-06, which is 17 days, across 215 commits, by one owner directing a series of AI coding sessions. As of this build it is 88 Python files, 112 JavaScript files, 24 TypeScript edge functions, 35 migrations and 65 documents: 2151 tracked files in total.</w:t>
+        <w:t xml:space="preserve">The platform is Start From Nowhere, a test-preparation site with five adaptive exam trainers, a college and business-school rankings library, a blog, a forum, subscriptions through two payment processors, and an admin console. It was built between 2026-09-19 and 2026-10-06, which is 17 days, across 216 commits, by one owner directing a series of AI coding sessions. As of this build it is 88 Python files, 112 JavaScript files, 24 TypeScript edge functions, 35 migrations and 65 documents: 2151 tracked files in total.</w:t>
       </w:r>
     </w:p>
     <w:p>
@@ -5990,7 +5990,7 @@
     </w:p>
     <w:p>
       <w:r>
-        <w:t xml:space="preserve">215 commits in 17 days, one owner, a series of AI sessions. This chapter is how that was actually run, including the parts that did not work.</w:t>
+        <w:t xml:space="preserve">216 commits in 17 days, one owner, a series of AI sessions. This chapter is how that was actually run, including the parts that did not work.</w:t>
       </w:r>
     </w:p>
     <w:p>
@@ -23562,7 +23562,7 @@
         <w:rPr>
           <w:i/>
         </w:rPr>
-        <w:t xml:space="preserve">2026-10-06, Wrong data shown or stored</w:t>
+        <w:t xml:space="preserve">2026-10-06, Wrong data shown or stored, `ef7a4c49bd4ab68eb05bf16d1fc55f1d1464d785` PR #263</w:t>
       </w:r>
     </w:p>
     <w:p>

</xml_diff>